<commit_message>
Çıktılar iki dilli: İngilizce not PDF/DOCX ve paket İngilizce kaynaktan
- build_outputs.py: not-pdf, docx ve paket adımları tr ve en için ayrı
  üretir (İngilizce antet, İngilizce başlık); EN kaynağı yoksa TR kopyası
- Alt süreçlere PYTHONUTF8: boruya yönlenen çıktıda cp1252 Türkçe log
  satırı mkdocs derlemesini çökertiyordu
- mkdocs.yml: git eklentileri CEN429_GIT=false ile kapatılabilir (yerel
  denetim derlemesi; varsayılan davranış aynı)
- content.html: git_info tanımsızsa yazar listesi boş geçilir
- 17 birimin sunum ve not çıktıları yeniden üretildi

Co-Authored-By: Claude Opus 5.5 (1M context) <noreply@anthropic.com>
</commit_message>
<xml_diff>
--- a/docs/syllabus/cen429-izlence-ders-notu.en.docx
+++ b/docs/syllabus/cen429-izlence-ders-notu.en.docx
@@ -2,40 +2,40 @@
 <file path=word/document.xml><?xml version="1.0" encoding="utf-8"?>
 <w:document xmlns:w="http://schemas.openxmlformats.org/wordprocessingml/2006/main" xmlns:m="http://schemas.openxmlformats.org/officeDocument/2006/math" xmlns:r="http://schemas.openxmlformats.org/officeDocument/2006/relationships" xmlns:o="urn:schemas-microsoft-com:office:office" xmlns:v="urn:schemas-microsoft-com:vml" xmlns:w10="urn:schemas-microsoft-com:office:word" xmlns:a="http://schemas.openxmlformats.org/drawingml/2006/main" xmlns:pic="http://schemas.openxmlformats.org/drawingml/2006/picture" xmlns:wp="http://schemas.openxmlformats.org/drawingml/2006/wordprocessingDrawing">
   <w:body>
-    <w:bookmarkStart w:id="39" w:name="recep-tayyip-erdoğan-üniversitesi"/>
+    <w:bookmarkStart w:id="39" w:name="recep-tayyip-erdoğan-university"/>
     <w:p>
       <w:pPr>
         <w:pStyle w:val="Heading1"/>
       </w:pPr>
       <w:r>
-        <w:t xml:space="preserve">Recep Tayyip Erdoğan Üniversitesi</w:t>
-      </w:r>
-    </w:p>
-    <w:bookmarkStart w:id="22" w:name="Xc64c28937d3d0738beb31156d5d6d7ccda23744"/>
+        <w:t xml:space="preserve">Recep Tayyip Erdoğan University</w:t>
+      </w:r>
+    </w:p>
+    <w:bookmarkStart w:id="22" w:name="Xf1278dab5c81dc14e56b33cd99aad4d5652b466"/>
     <w:p>
       <w:pPr>
         <w:pStyle w:val="Heading2"/>
       </w:pPr>
       <w:r>
-        <w:t xml:space="preserve">Mühendislik ve Mimarlık Fakültesi — Bilgisayar Mühendisliği</w:t>
-      </w:r>
-    </w:p>
-    <w:bookmarkStart w:id="21" w:name="X3847d7dd19acc307c5df7cfd2f8ebf9117e2f9e"/>
+        <w:t xml:space="preserve">Faculty of Engineering and Architecture — Computer Engineering</w:t>
+      </w:r>
+    </w:p>
+    <w:bookmarkStart w:id="21" w:name="cen429-secure-programming-syllabus"/>
     <w:p>
       <w:pPr>
         <w:pStyle w:val="Heading3"/>
       </w:pPr>
       <w:r>
-        <w:t xml:space="preserve">CEN429 Güvenli Programlama — Ders İzlencesi</w:t>
-      </w:r>
-    </w:p>
-    <w:bookmarkStart w:id="20" w:name="güz-yarıyılı"/>
+        <w:t xml:space="preserve">CEN429 Secure Programming — Syllabus</w:t>
+      </w:r>
+    </w:p>
+    <w:bookmarkStart w:id="20" w:name="fall-semester-2026-2027"/>
     <w:p>
       <w:pPr>
         <w:pStyle w:val="Heading4"/>
       </w:pPr>
       <w:r>
-        <w:t xml:space="preserve">2026-2027 Güz Yarıyılı</w:t>
+        <w:t xml:space="preserve">Fall Semester, 2026-2027</w:t>
       </w:r>
     </w:p>
     <w:p>
@@ -48,13 +48,13 @@
     <w:bookmarkEnd w:id="20"/>
     <w:bookmarkEnd w:id="21"/>
     <w:bookmarkEnd w:id="22"/>
-    <w:bookmarkStart w:id="23" w:name="ders-bilgileri"/>
+    <w:bookmarkStart w:id="23" w:name="course-information"/>
     <w:p>
       <w:pPr>
         <w:pStyle w:val="Heading2"/>
       </w:pPr>
       <w:r>
-        <w:t xml:space="preserve">Ders Bilgileri</w:t>
+        <w:t xml:space="preserve">Course Information</w:t>
       </w:r>
     </w:p>
     <w:tbl>
@@ -80,18 +80,18 @@
                 <w:b/>
                 <w:bCs/>
               </w:rPr>
-              <w:t xml:space="preserve">Öğretim üyesi</w:t>
-            </w:r>
-          </w:p>
-        </w:tc>
-        <w:tc>
-          <w:tcPr/>
-          <w:p>
-            <w:pPr>
-              <w:pStyle w:val="Compact"/>
-            </w:pPr>
-            <w:r>
-              <w:t xml:space="preserve">Dr. Öğr. Üyesi Uğur CORUH</w:t>
+              <w:t xml:space="preserve">Instructor</w:t>
+            </w:r>
+          </w:p>
+        </w:tc>
+        <w:tc>
+          <w:tcPr/>
+          <w:p>
+            <w:pPr>
+              <w:pStyle w:val="Compact"/>
+            </w:pPr>
+            <w:r>
+              <w:t xml:space="preserve">Asst. Prof. Dr. Uğur CORUH</w:t>
             </w:r>
           </w:p>
         </w:tc>
@@ -108,18 +108,18 @@
                 <w:b/>
                 <w:bCs/>
               </w:rPr>
-              <w:t xml:space="preserve">İletişim</w:t>
-            </w:r>
-          </w:p>
-        </w:tc>
-        <w:tc>
-          <w:tcPr/>
-          <w:p>
-            <w:pPr>
-              <w:pStyle w:val="Compact"/>
-            </w:pPr>
-            <w:r>
-              <w:t xml:space="preserve">ugur.coruh@erdogan.edu.tr — konu satırı</w:t>
+              <w:t xml:space="preserve">Contact</w:t>
+            </w:r>
+          </w:p>
+        </w:tc>
+        <w:tc>
+          <w:tcPr/>
+          <w:p>
+            <w:pPr>
+              <w:pStyle w:val="Compact"/>
+            </w:pPr>
+            <w:r>
+              <w:t xml:space="preserve">ugur.coruh@erdogan.edu.tr — subject line must start with</w:t>
             </w:r>
             <w:r>
               <w:t xml:space="preserve"> </w:t>
@@ -131,12 +131,6 @@
               </w:rPr>
               <w:t xml:space="preserve">[CEN429]</w:t>
             </w:r>
-            <w:r>
-              <w:t xml:space="preserve"> </w:t>
-            </w:r>
-            <w:r>
-              <w:t xml:space="preserve">ile başlamalıdır</w:t>
-            </w:r>
           </w:p>
         </w:tc>
       </w:tr>
@@ -152,7 +146,7 @@
                 <w:b/>
                 <w:bCs/>
               </w:rPr>
-              <w:t xml:space="preserve">Ofis</w:t>
+              <w:t xml:space="preserve">Office</w:t>
             </w:r>
           </w:p>
         </w:tc>
@@ -180,18 +174,18 @@
                 <w:b/>
                 <w:bCs/>
               </w:rPr>
-              <w:t xml:space="preserve">Görüşme saatleri</w:t>
-            </w:r>
-          </w:p>
-        </w:tc>
-        <w:tc>
-          <w:tcPr/>
-          <w:p>
-            <w:pPr>
-              <w:pStyle w:val="Compact"/>
-            </w:pPr>
-            <w:r>
-              <w:t xml:space="preserve">E-posta ile randevu; ofiste ya da üniversite hesabıyla çevrim içi</w:t>
+              <w:t xml:space="preserve">Office hours</w:t>
+            </w:r>
+          </w:p>
+        </w:tc>
+        <w:tc>
+          <w:tcPr/>
+          <w:p>
+            <w:pPr>
+              <w:pStyle w:val="Compact"/>
+            </w:pPr>
+            <w:r>
+              <w:t xml:space="preserve">By appointment by e-mail; meetings in the office or online with the university account</w:t>
             </w:r>
           </w:p>
         </w:tc>
@@ -208,18 +202,18 @@
                 <w:b/>
                 <w:bCs/>
               </w:rPr>
-              <w:t xml:space="preserve">Ders günü, saati, dersliği</w:t>
-            </w:r>
-          </w:p>
-        </w:tc>
-        <w:tc>
-          <w:tcPr/>
-          <w:p>
-            <w:pPr>
-              <w:pStyle w:val="Compact"/>
-            </w:pPr>
-            <w:r>
-              <w:t xml:space="preserve">Cuma 09:00–12:00 · İİBF ve Hukuk Fakültesi Binası, D-402 (ED-K4-2)</w:t>
+              <w:t xml:space="preserve">Lecture day, time, room</w:t>
+            </w:r>
+          </w:p>
+        </w:tc>
+        <w:tc>
+          <w:tcPr/>
+          <w:p>
+            <w:pPr>
+              <w:pStyle w:val="Compact"/>
+            </w:pPr>
+            <w:r>
+              <w:t xml:space="preserve">Friday 09:00–12:00 · İİBF &amp; Faculty of Law Building, D-402 (ED-K4-2)</w:t>
             </w:r>
           </w:p>
         </w:tc>
@@ -236,7 +230,7 @@
                 <w:b/>
                 <w:bCs/>
               </w:rPr>
-              <w:t xml:space="preserve">Ders web sitesi</w:t>
+              <w:t xml:space="preserve">Course website</w:t>
             </w:r>
           </w:p>
         </w:tc>
@@ -264,18 +258,18 @@
                 <w:b/>
                 <w:bCs/>
               </w:rPr>
-              <w:t xml:space="preserve">Ders sınıfı</w:t>
-            </w:r>
-          </w:p>
-        </w:tc>
-        <w:tc>
-          <w:tcPr/>
-          <w:p>
-            <w:pPr>
-              <w:pStyle w:val="Compact"/>
-            </w:pPr>
-            <w:r>
-              <w:t xml:space="preserve">Her dönem yeni sınıf açılır; sınıf kodu 1. haftada duyurulur</w:t>
+              <w:t xml:space="preserve">Course class</w:t>
+            </w:r>
+          </w:p>
+        </w:tc>
+        <w:tc>
+          <w:tcPr/>
+          <w:p>
+            <w:pPr>
+              <w:pStyle w:val="Compact"/>
+            </w:pPr>
+            <w:r>
+              <w:t xml:space="preserve">A new class is opened every term; the class code is announced in week 1</w:t>
             </w:r>
           </w:p>
         </w:tc>
@@ -292,18 +286,18 @@
                 <w:b/>
                 <w:bCs/>
               </w:rPr>
-              <w:t xml:space="preserve">Eğitim dili</w:t>
-            </w:r>
-          </w:p>
-        </w:tc>
-        <w:tc>
-          <w:tcPr/>
-          <w:p>
-            <w:pPr>
-              <w:pStyle w:val="Compact"/>
-            </w:pPr>
-            <w:r>
-              <w:t xml:space="preserve">Türkçe</w:t>
+              <w:t xml:space="preserve">Language</w:t>
+            </w:r>
+          </w:p>
+        </w:tc>
+        <w:tc>
+          <w:tcPr/>
+          <w:p>
+            <w:pPr>
+              <w:pStyle w:val="Compact"/>
+            </w:pPr>
+            <w:r>
+              <w:t xml:space="preserve">Turkish</w:t>
             </w:r>
           </w:p>
         </w:tc>
@@ -320,18 +314,18 @@
                 <w:b/>
                 <w:bCs/>
               </w:rPr>
-              <w:t xml:space="preserve">Tür / yarıyıl</w:t>
-            </w:r>
-          </w:p>
-        </w:tc>
-        <w:tc>
-          <w:tcPr/>
-          <w:p>
-            <w:pPr>
-              <w:pStyle w:val="Compact"/>
-            </w:pPr>
-            <w:r>
-              <w:t xml:space="preserve">Seçmeli · 7. yarıyıl</w:t>
+              <w:t xml:space="preserve">Type / semester</w:t>
+            </w:r>
+          </w:p>
+        </w:tc>
+        <w:tc>
+          <w:tcPr/>
+          <w:p>
+            <w:pPr>
+              <w:pStyle w:val="Compact"/>
+            </w:pPr>
+            <w:r>
+              <w:t xml:space="preserve">Elective · 7th semester</w:t>
             </w:r>
           </w:p>
         </w:tc>
@@ -348,18 +342,18 @@
                 <w:b/>
                 <w:bCs/>
               </w:rPr>
-              <w:t xml:space="preserve">Haftalık saat / kredi / AKTS</w:t>
-            </w:r>
-          </w:p>
-        </w:tc>
-        <w:tc>
-          <w:tcPr/>
-          <w:p>
-            <w:pPr>
-              <w:pStyle w:val="Compact"/>
-            </w:pPr>
-            <w:r>
-              <w:t xml:space="preserve">Kuramsal 3 saat · Kredi 3 · AKTS 5</w:t>
+              <w:t xml:space="preserve">Weekly hours / credit / ECTS</w:t>
+            </w:r>
+          </w:p>
+        </w:tc>
+        <w:tc>
+          <w:tcPr/>
+          <w:p>
+            <w:pPr>
+              <w:pStyle w:val="Compact"/>
+            </w:pPr>
+            <w:r>
+              <w:t xml:space="preserve">Theory 3 h · Credit 3 · ECTS 5</w:t>
             </w:r>
           </w:p>
         </w:tc>
@@ -376,18 +370,18 @@
                 <w:b/>
                 <w:bCs/>
               </w:rPr>
-              <w:t xml:space="preserve">Ön koşul</w:t>
-            </w:r>
-          </w:p>
-        </w:tc>
-        <w:tc>
-          <w:tcPr/>
-          <w:p>
-            <w:pPr>
-              <w:pStyle w:val="Compact"/>
-            </w:pPr>
-            <w:r>
-              <w:t xml:space="preserve">CEN107 Algoritmalar ve Programlama I (eski kodu CE103)</w:t>
+              <w:t xml:space="preserve">Prerequisite</w:t>
+            </w:r>
+          </w:p>
+        </w:tc>
+        <w:tc>
+          <w:tcPr/>
+          <w:p>
+            <w:pPr>
+              <w:pStyle w:val="Compact"/>
+            </w:pPr>
+            <w:r>
+              <w:t xml:space="preserve">CEN107 Algorithms and Programming I (former code CE103)</w:t>
             </w:r>
           </w:p>
         </w:tc>
@@ -401,13 +395,13 @@
       </w:r>
     </w:p>
     <w:bookmarkEnd w:id="23"/>
-    <w:bookmarkStart w:id="24" w:name="a.-dersin-tanımı"/>
+    <w:bookmarkStart w:id="24" w:name="a.-course-description"/>
     <w:p>
       <w:pPr>
         <w:pStyle w:val="Heading2"/>
       </w:pPr>
       <w:r>
-        <w:t xml:space="preserve">A. Dersin Tanımı</w:t>
+        <w:t xml:space="preserve">A. Course Description</w:t>
       </w:r>
     </w:p>
     <w:p>
@@ -415,43 +409,43 @@
         <w:pStyle w:val="FirstParagraph"/>
       </w:pPr>
       <w:r>
-        <w:t xml:space="preserve">Bu ders, güvenli yazılım geliştirme tekniklerini anlamaya yönelik kapsamlı bir yaklaşım sunar. Öğrenciler arabellek</w:t>
-      </w:r>
-      <w:r>
-        <w:t xml:space="preserve"> </w:t>
-      </w:r>
-      <w:r>
-        <w:t xml:space="preserve">taşması, bellek sızıntıları ve enjeksiyon saldırıları gibi yaygın güvenlik açıklarını ele almak için yazılım koruma</w:t>
-      </w:r>
-      <w:r>
-        <w:t xml:space="preserve"> </w:t>
-      </w:r>
-      <w:r>
-        <w:t xml:space="preserve">yöntemlerini öğrenir: veri güvenliği ve kriptografi, C/C++ ve Java için kod sağlamlaştırma, çalışma zamanı uygulama öz</w:t>
-      </w:r>
-      <w:r>
-        <w:t xml:space="preserve"> </w:t>
-      </w:r>
-      <w:r>
-        <w:t xml:space="preserve">koruması (RASP), kod gizleme ve çeşitlendirme, whitebox kriptografi, güvenlik standartları ve sızma testi planlaması.</w:t>
-      </w:r>
-      <w:r>
-        <w:t xml:space="preserve"> </w:t>
-      </w:r>
-      <w:r>
-        <w:t xml:space="preserve">Ders, güvenli yazılım geliştirmedeki gerçek dünya uygulamalarına ve en iyi uygulamalara odaklanır. Her konu hatalı kod</w:t>
-      </w:r>
-      <w:r>
-        <w:t xml:space="preserve"> </w:t>
-      </w:r>
-      <w:r>
-        <w:t xml:space="preserve">→ saldırı → düzeltme sırasıyla, derste yapılan uygulamalarla ve bir sertifikasyon sürecinden geçiyormuş gibi</w:t>
-      </w:r>
-      <w:r>
-        <w:t xml:space="preserve"> </w:t>
-      </w:r>
-      <w:r>
-        <w:t xml:space="preserve">yürütülen dönem projesiyle pekiştirilir.</w:t>
+        <w:t xml:space="preserve">This course offers a comprehensive approach to understanding secure software development techniques. Students learn</w:t>
+      </w:r>
+      <w:r>
+        <w:t xml:space="preserve"> </w:t>
+      </w:r>
+      <w:r>
+        <w:t xml:space="preserve">software protection methods to address common vulnerabilities such as buffer overflows, memory leaks and injection</w:t>
+      </w:r>
+      <w:r>
+        <w:t xml:space="preserve"> </w:t>
+      </w:r>
+      <w:r>
+        <w:t xml:space="preserve">attacks: data security and cryptography, code hardening for C/C++ and Java, runtime application self-protection</w:t>
+      </w:r>
+      <w:r>
+        <w:t xml:space="preserve"> </w:t>
+      </w:r>
+      <w:r>
+        <w:t xml:space="preserve">(RASP), code obfuscation and diversification, white-box cryptography, security standards and penetration test</w:t>
+      </w:r>
+      <w:r>
+        <w:t xml:space="preserve"> </w:t>
+      </w:r>
+      <w:r>
+        <w:t xml:space="preserve">planning. The course focuses on real-world applications and best practices in secure software development. Each topic</w:t>
+      </w:r>
+      <w:r>
+        <w:t xml:space="preserve"> </w:t>
+      </w:r>
+      <w:r>
+        <w:t xml:space="preserve">follows the order vulnerable code → attack → fix and is reinforced by in-class exercises and by a term project run as</w:t>
+      </w:r>
+      <w:r>
+        <w:t xml:space="preserve"> </w:t>
+      </w:r>
+      <w:r>
+        <w:t xml:space="preserve">if it were going through a certification process.</w:t>
       </w:r>
     </w:p>
     <w:p>
@@ -462,13 +456,13 @@
       </w:r>
     </w:p>
     <w:bookmarkEnd w:id="24"/>
-    <w:bookmarkStart w:id="26" w:name="b.-öğrenme-çıktıları"/>
+    <w:bookmarkStart w:id="26" w:name="b.-learning-outcomes"/>
     <w:p>
       <w:pPr>
         <w:pStyle w:val="Heading2"/>
       </w:pPr>
       <w:r>
-        <w:t xml:space="preserve">B. Öğrenme Çıktıları</w:t>
+        <w:t xml:space="preserve">B. Learning Outcomes</w:t>
       </w:r>
     </w:p>
     <w:p>
@@ -476,7 +470,7 @@
         <w:pStyle w:val="FirstParagraph"/>
       </w:pPr>
       <w:r>
-        <w:t xml:space="preserve">Bu dersi başarıyla tamamlayan öğrenci:</w:t>
+        <w:t xml:space="preserve">A student who completes this course successfully:</w:t>
       </w:r>
     </w:p>
     <w:tbl>
@@ -501,18 +495,18 @@
               <w:pStyle w:val="Compact"/>
             </w:pPr>
             <w:r>
-              <w:t xml:space="preserve">Kod</w:t>
-            </w:r>
-          </w:p>
-        </w:tc>
-        <w:tc>
-          <w:tcPr/>
-          <w:p>
-            <w:pPr>
-              <w:pStyle w:val="Compact"/>
-            </w:pPr>
-            <w:r>
-              <w:t xml:space="preserve">Öğrenme çıktısı</w:t>
+              <w:t xml:space="preserve">Code</w:t>
+            </w:r>
+          </w:p>
+        </w:tc>
+        <w:tc>
+          <w:tcPr/>
+          <w:p>
+            <w:pPr>
+              <w:pStyle w:val="Compact"/>
+            </w:pPr>
+            <w:r>
+              <w:t xml:space="preserve">Learning outcome</w:t>
             </w:r>
           </w:p>
         </w:tc>
@@ -525,18 +519,18 @@
               <w:pStyle w:val="Compact"/>
             </w:pPr>
             <w:r>
-              <w:t xml:space="preserve">ÖÇ.1</w:t>
-            </w:r>
-          </w:p>
-        </w:tc>
-        <w:tc>
-          <w:tcPr/>
-          <w:p>
-            <w:pPr>
-              <w:pStyle w:val="Compact"/>
-            </w:pPr>
-            <w:r>
-              <w:t xml:space="preserve">Yaygın yazılım güvenlik açıklarını (arabellek taşması, enjeksiyon saldırıları, bellek sızıntıları vb.) tanımlar ve sınıflandırır.</w:t>
+              <w:t xml:space="preserve">LO.1</w:t>
+            </w:r>
+          </w:p>
+        </w:tc>
+        <w:tc>
+          <w:tcPr/>
+          <w:p>
+            <w:pPr>
+              <w:pStyle w:val="Compact"/>
+            </w:pPr>
+            <w:r>
+              <w:t xml:space="preserve">Identifies and classifies common software vulnerabilities (buffer overflow, injection attacks, memory leaks, etc.).</w:t>
             </w:r>
           </w:p>
         </w:tc>
@@ -549,18 +543,18 @@
               <w:pStyle w:val="Compact"/>
             </w:pPr>
             <w:r>
-              <w:t xml:space="preserve">ÖÇ.2</w:t>
-            </w:r>
-          </w:p>
-        </w:tc>
-        <w:tc>
-          <w:tcPr/>
-          <w:p>
-            <w:pPr>
-              <w:pStyle w:val="Compact"/>
-            </w:pPr>
-            <w:r>
-              <w:t xml:space="preserve">Hassas verileri korumak için temel şifreleme yöntemlerini (simetrik/asimetrik, özet fonksiyonları) ve güvenli iletişim ilkelerini (SSL/TLS) açıklar.</w:t>
+              <w:t xml:space="preserve">LO.2</w:t>
+            </w:r>
+          </w:p>
+        </w:tc>
+        <w:tc>
+          <w:tcPr/>
+          <w:p>
+            <w:pPr>
+              <w:pStyle w:val="Compact"/>
+            </w:pPr>
+            <w:r>
+              <w:t xml:space="preserve">Explains basic encryption methods (symmetric/asymmetric, hash functions) and secure communication principles (SSL/TLS) for protecting sensitive data.</w:t>
             </w:r>
           </w:p>
         </w:tc>
@@ -573,18 +567,18 @@
               <w:pStyle w:val="Compact"/>
             </w:pPr>
             <w:r>
-              <w:t xml:space="preserve">ÖÇ.3</w:t>
-            </w:r>
-          </w:p>
-        </w:tc>
-        <w:tc>
-          <w:tcPr/>
-          <w:p>
-            <w:pPr>
-              <w:pStyle w:val="Compact"/>
-            </w:pPr>
-            <w:r>
-              <w:t xml:space="preserve">Kod sağlamlaştırma tekniklerini (girdi doğrulama, güvenli bellek yönetimi, RASP, kod gizleme/karıştırma) açıklar ve farklı diller (C/C++, Java) için uygular.</w:t>
+              <w:t xml:space="preserve">LO.3</w:t>
+            </w:r>
+          </w:p>
+        </w:tc>
+        <w:tc>
+          <w:tcPr/>
+          <w:p>
+            <w:pPr>
+              <w:pStyle w:val="Compact"/>
+            </w:pPr>
+            <w:r>
+              <w:t xml:space="preserve">Explains code hardening techniques (input validation, secure memory management, RASP, code obfuscation) and applies them to different languages (C/C++, Java).</w:t>
             </w:r>
           </w:p>
         </w:tc>
@@ -597,18 +591,18 @@
               <w:pStyle w:val="Compact"/>
             </w:pPr>
             <w:r>
-              <w:t xml:space="preserve">ÖÇ.4</w:t>
-            </w:r>
-          </w:p>
-        </w:tc>
-        <w:tc>
-          <w:tcPr/>
-          <w:p>
-            <w:pPr>
-              <w:pStyle w:val="Compact"/>
-            </w:pPr>
-            <w:r>
-              <w:t xml:space="preserve">Şifreleme ve kimlik doğrulama mekanizmalarını kullanarak güvenli iletişim kanalları kurma prensiplerini açıklar.</w:t>
+              <w:t xml:space="preserve">LO.4</w:t>
+            </w:r>
+          </w:p>
+        </w:tc>
+        <w:tc>
+          <w:tcPr/>
+          <w:p>
+            <w:pPr>
+              <w:pStyle w:val="Compact"/>
+            </w:pPr>
+            <w:r>
+              <w:t xml:space="preserve">Explains the principles of building secure communication channels using encryption and authentication mechanisms.</w:t>
             </w:r>
           </w:p>
         </w:tc>
@@ -621,18 +615,18 @@
               <w:pStyle w:val="Compact"/>
             </w:pPr>
             <w:r>
-              <w:t xml:space="preserve">ÖÇ.5</w:t>
-            </w:r>
-          </w:p>
-        </w:tc>
-        <w:tc>
-          <w:tcPr/>
-          <w:p>
-            <w:pPr>
-              <w:pStyle w:val="Compact"/>
-            </w:pPr>
-            <w:r>
-              <w:t xml:space="preserve">Güvenli yazılım tasarımı ilkelerini (en az ayrıcalık, savunma derinliği vb.) ve savunma stratejilerini kullanarak yazılım planı oluşturur.</w:t>
+              <w:t xml:space="preserve">LO.5</w:t>
+            </w:r>
+          </w:p>
+        </w:tc>
+        <w:tc>
+          <w:tcPr/>
+          <w:p>
+            <w:pPr>
+              <w:pStyle w:val="Compact"/>
+            </w:pPr>
+            <w:r>
+              <w:t xml:space="preserve">Creates a software plan using secure software design principles (least privilege, defence in depth, etc.) and defence strategies.</w:t>
             </w:r>
           </w:p>
         </w:tc>
@@ -645,18 +639,18 @@
               <w:pStyle w:val="Compact"/>
             </w:pPr>
             <w:r>
-              <w:t xml:space="preserve">ÖÇ.6</w:t>
-            </w:r>
-          </w:p>
-        </w:tc>
-        <w:tc>
-          <w:tcPr/>
-          <w:p>
-            <w:pPr>
-              <w:pStyle w:val="Compact"/>
-            </w:pPr>
-            <w:r>
-              <w:t xml:space="preserve">Yazılım güvenlik açıklarını tespit etmek için temel güvenlik incelemesi ve güvenlik açığı değerlendirme yöntemlerini bilir.</w:t>
+              <w:t xml:space="preserve">LO.6</w:t>
+            </w:r>
+          </w:p>
+        </w:tc>
+        <w:tc>
+          <w:tcPr/>
+          <w:p>
+            <w:pPr>
+              <w:pStyle w:val="Compact"/>
+            </w:pPr>
+            <w:r>
+              <w:t xml:space="preserve">Knows basic security review and vulnerability assessment methods for detecting software vulnerabilities.</w:t>
             </w:r>
           </w:p>
         </w:tc>
@@ -669,30 +663,30 @@
               <w:pStyle w:val="Compact"/>
             </w:pPr>
             <w:r>
-              <w:t xml:space="preserve">ÖÇ.7</w:t>
-            </w:r>
-          </w:p>
-        </w:tc>
-        <w:tc>
-          <w:tcPr/>
-          <w:p>
-            <w:pPr>
-              <w:pStyle w:val="Compact"/>
-            </w:pPr>
-            <w:r>
-              <w:t xml:space="preserve">Güvenli programlama standartlarını (örn: ETSI, EMV, FIPS) ve sızma testi planlaması prensiplerini bilir.</w:t>
+              <w:t xml:space="preserve">LO.7</w:t>
+            </w:r>
+          </w:p>
+        </w:tc>
+        <w:tc>
+          <w:tcPr/>
+          <w:p>
+            <w:pPr>
+              <w:pStyle w:val="Compact"/>
+            </w:pPr>
+            <w:r>
+              <w:t xml:space="preserve">Knows secure programming standards (e.g. ETSI, EMV, FIPS) and the principles of penetration test planning.</w:t>
             </w:r>
           </w:p>
         </w:tc>
       </w:tr>
     </w:tbl>
-    <w:bookmarkStart w:id="25" w:name="X48c00bca95fe3638df0c9d7a2b32720dc960e22"/>
+    <w:bookmarkStart w:id="25" w:name="X8664d3ebde3fd601a87e584f5729272c2abc229"/>
     <w:p>
       <w:pPr>
         <w:pStyle w:val="Heading3"/>
       </w:pPr>
       <w:r>
-        <w:t xml:space="preserve">Öğrenme çıktılarının program çıktılarına katkısı (0–5)</w:t>
+        <w:t xml:space="preserve">Contribution of learning outcomes to program outcomes (0–5)</w:t>
       </w:r>
     </w:p>
     <w:tbl>
@@ -736,128 +730,128 @@
               <w:pStyle w:val="Compact"/>
             </w:pPr>
             <w:r>
-              <w:t xml:space="preserve">PÇ.1</w:t>
-            </w:r>
-          </w:p>
-        </w:tc>
-        <w:tc>
-          <w:tcPr/>
-          <w:p>
-            <w:pPr>
-              <w:pStyle w:val="Compact"/>
-            </w:pPr>
-            <w:r>
-              <w:t xml:space="preserve">PÇ.2</w:t>
-            </w:r>
-          </w:p>
-        </w:tc>
-        <w:tc>
-          <w:tcPr/>
-          <w:p>
-            <w:pPr>
-              <w:pStyle w:val="Compact"/>
-            </w:pPr>
-            <w:r>
-              <w:t xml:space="preserve">PÇ.3</w:t>
-            </w:r>
-          </w:p>
-        </w:tc>
-        <w:tc>
-          <w:tcPr/>
-          <w:p>
-            <w:pPr>
-              <w:pStyle w:val="Compact"/>
-            </w:pPr>
-            <w:r>
-              <w:t xml:space="preserve">PÇ.4</w:t>
-            </w:r>
-          </w:p>
-        </w:tc>
-        <w:tc>
-          <w:tcPr/>
-          <w:p>
-            <w:pPr>
-              <w:pStyle w:val="Compact"/>
-            </w:pPr>
-            <w:r>
-              <w:t xml:space="preserve">PÇ.5</w:t>
-            </w:r>
-          </w:p>
-        </w:tc>
-        <w:tc>
-          <w:tcPr/>
-          <w:p>
-            <w:pPr>
-              <w:pStyle w:val="Compact"/>
-            </w:pPr>
-            <w:r>
-              <w:t xml:space="preserve">PÇ.6</w:t>
-            </w:r>
-          </w:p>
-        </w:tc>
-        <w:tc>
-          <w:tcPr/>
-          <w:p>
-            <w:pPr>
-              <w:pStyle w:val="Compact"/>
-            </w:pPr>
-            <w:r>
-              <w:t xml:space="preserve">PÇ.7</w:t>
-            </w:r>
-          </w:p>
-        </w:tc>
-        <w:tc>
-          <w:tcPr/>
-          <w:p>
-            <w:pPr>
-              <w:pStyle w:val="Compact"/>
-            </w:pPr>
-            <w:r>
-              <w:t xml:space="preserve">PÇ.8</w:t>
-            </w:r>
-          </w:p>
-        </w:tc>
-        <w:tc>
-          <w:tcPr/>
-          <w:p>
-            <w:pPr>
-              <w:pStyle w:val="Compact"/>
-            </w:pPr>
-            <w:r>
-              <w:t xml:space="preserve">PÇ.9</w:t>
-            </w:r>
-          </w:p>
-        </w:tc>
-        <w:tc>
-          <w:tcPr/>
-          <w:p>
-            <w:pPr>
-              <w:pStyle w:val="Compact"/>
-            </w:pPr>
-            <w:r>
-              <w:t xml:space="preserve">PÇ.10</w:t>
-            </w:r>
-          </w:p>
-        </w:tc>
-        <w:tc>
-          <w:tcPr/>
-          <w:p>
-            <w:pPr>
-              <w:pStyle w:val="Compact"/>
-            </w:pPr>
-            <w:r>
-              <w:t xml:space="preserve">PÇ.11</w:t>
-            </w:r>
-          </w:p>
-        </w:tc>
-        <w:tc>
-          <w:tcPr/>
-          <w:p>
-            <w:pPr>
-              <w:pStyle w:val="Compact"/>
-            </w:pPr>
-            <w:r>
-              <w:t xml:space="preserve">PÇ.12</w:t>
+              <w:t xml:space="preserve">PO.1</w:t>
+            </w:r>
+          </w:p>
+        </w:tc>
+        <w:tc>
+          <w:tcPr/>
+          <w:p>
+            <w:pPr>
+              <w:pStyle w:val="Compact"/>
+            </w:pPr>
+            <w:r>
+              <w:t xml:space="preserve">PO.2</w:t>
+            </w:r>
+          </w:p>
+        </w:tc>
+        <w:tc>
+          <w:tcPr/>
+          <w:p>
+            <w:pPr>
+              <w:pStyle w:val="Compact"/>
+            </w:pPr>
+            <w:r>
+              <w:t xml:space="preserve">PO.3</w:t>
+            </w:r>
+          </w:p>
+        </w:tc>
+        <w:tc>
+          <w:tcPr/>
+          <w:p>
+            <w:pPr>
+              <w:pStyle w:val="Compact"/>
+            </w:pPr>
+            <w:r>
+              <w:t xml:space="preserve">PO.4</w:t>
+            </w:r>
+          </w:p>
+        </w:tc>
+        <w:tc>
+          <w:tcPr/>
+          <w:p>
+            <w:pPr>
+              <w:pStyle w:val="Compact"/>
+            </w:pPr>
+            <w:r>
+              <w:t xml:space="preserve">PO.5</w:t>
+            </w:r>
+          </w:p>
+        </w:tc>
+        <w:tc>
+          <w:tcPr/>
+          <w:p>
+            <w:pPr>
+              <w:pStyle w:val="Compact"/>
+            </w:pPr>
+            <w:r>
+              <w:t xml:space="preserve">PO.6</w:t>
+            </w:r>
+          </w:p>
+        </w:tc>
+        <w:tc>
+          <w:tcPr/>
+          <w:p>
+            <w:pPr>
+              <w:pStyle w:val="Compact"/>
+            </w:pPr>
+            <w:r>
+              <w:t xml:space="preserve">PO.7</w:t>
+            </w:r>
+          </w:p>
+        </w:tc>
+        <w:tc>
+          <w:tcPr/>
+          <w:p>
+            <w:pPr>
+              <w:pStyle w:val="Compact"/>
+            </w:pPr>
+            <w:r>
+              <w:t xml:space="preserve">PO.8</w:t>
+            </w:r>
+          </w:p>
+        </w:tc>
+        <w:tc>
+          <w:tcPr/>
+          <w:p>
+            <w:pPr>
+              <w:pStyle w:val="Compact"/>
+            </w:pPr>
+            <w:r>
+              <w:t xml:space="preserve">PO.9</w:t>
+            </w:r>
+          </w:p>
+        </w:tc>
+        <w:tc>
+          <w:tcPr/>
+          <w:p>
+            <w:pPr>
+              <w:pStyle w:val="Compact"/>
+            </w:pPr>
+            <w:r>
+              <w:t xml:space="preserve">PO.10</w:t>
+            </w:r>
+          </w:p>
+        </w:tc>
+        <w:tc>
+          <w:tcPr/>
+          <w:p>
+            <w:pPr>
+              <w:pStyle w:val="Compact"/>
+            </w:pPr>
+            <w:r>
+              <w:t xml:space="preserve">PO.11</w:t>
+            </w:r>
+          </w:p>
+        </w:tc>
+        <w:tc>
+          <w:tcPr/>
+          <w:p>
+            <w:pPr>
+              <w:pStyle w:val="Compact"/>
+            </w:pPr>
+            <w:r>
+              <w:t xml:space="preserve">PO.12</w:t>
             </w:r>
           </w:p>
         </w:tc>
@@ -870,7 +864,7 @@
               <w:pStyle w:val="Compact"/>
             </w:pPr>
             <w:r>
-              <w:t xml:space="preserve">ÖÇ.1</w:t>
+              <w:t xml:space="preserve">LO.1</w:t>
             </w:r>
           </w:p>
         </w:tc>
@@ -1015,7 +1009,7 @@
               <w:pStyle w:val="Compact"/>
             </w:pPr>
             <w:r>
-              <w:t xml:space="preserve">ÖÇ.2</w:t>
+              <w:t xml:space="preserve">LO.2</w:t>
             </w:r>
           </w:p>
         </w:tc>
@@ -1160,7 +1154,7 @@
               <w:pStyle w:val="Compact"/>
             </w:pPr>
             <w:r>
-              <w:t xml:space="preserve">ÖÇ.3</w:t>
+              <w:t xml:space="preserve">LO.3</w:t>
             </w:r>
           </w:p>
         </w:tc>
@@ -1305,7 +1299,7 @@
               <w:pStyle w:val="Compact"/>
             </w:pPr>
             <w:r>
-              <w:t xml:space="preserve">ÖÇ.4</w:t>
+              <w:t xml:space="preserve">LO.4</w:t>
             </w:r>
           </w:p>
         </w:tc>
@@ -1450,7 +1444,7 @@
               <w:pStyle w:val="Compact"/>
             </w:pPr>
             <w:r>
-              <w:t xml:space="preserve">ÖÇ.5</w:t>
+              <w:t xml:space="preserve">LO.5</w:t>
             </w:r>
           </w:p>
         </w:tc>
@@ -1595,7 +1589,7 @@
               <w:pStyle w:val="Compact"/>
             </w:pPr>
             <w:r>
-              <w:t xml:space="preserve">ÖÇ.6</w:t>
+              <w:t xml:space="preserve">LO.6</w:t>
             </w:r>
           </w:p>
         </w:tc>
@@ -1740,7 +1734,7 @@
               <w:pStyle w:val="Compact"/>
             </w:pPr>
             <w:r>
-              <w:t xml:space="preserve">ÖÇ.7</w:t>
+              <w:t xml:space="preserve">LO.7</w:t>
             </w:r>
           </w:p>
         </w:tc>
@@ -1883,13 +1877,13 @@
         <w:pStyle w:val="BodyText"/>
       </w:pPr>
       <w:r>
-        <w:t xml:space="preserve">PÇ.2 Problem çözme · PÇ.3 Tasarım · PÇ.4 Modern teknik ve araçlar · PÇ.5 Araştırma ve deney · PÇ.8 İletişim ·</w:t>
-      </w:r>
-      <w:r>
-        <w:t xml:space="preserve"> </w:t>
-      </w:r>
-      <w:r>
-        <w:t xml:space="preserve">PÇ.9 Toplumsal bilinç · PÇ.11 Etik ve standartlar · PÇ.12 Proje ve risk yönetimi.</w:t>
+        <w:t xml:space="preserve">PO.2 Problem solving · PO.3 Design · PO.4 Modern tools and techniques · PO.5 Research and experimentation ·</w:t>
+      </w:r>
+      <w:r>
+        <w:t xml:space="preserve"> </w:t>
+      </w:r>
+      <w:r>
+        <w:t xml:space="preserve">PO.8 Communication · PO.9 Social awareness · PO.11 Ethics and standards · PO.12 Project and risk management.</w:t>
       </w:r>
     </w:p>
     <w:p>
@@ -1901,13 +1895,13 @@
     </w:p>
     <w:bookmarkEnd w:id="25"/>
     <w:bookmarkEnd w:id="26"/>
-    <w:bookmarkStart w:id="27" w:name="c.-haftalık-program"/>
+    <w:bookmarkStart w:id="27" w:name="c.-weekly-schedule"/>
     <w:p>
       <w:pPr>
         <w:pStyle w:val="Heading2"/>
       </w:pPr>
       <w:r>
-        <w:t xml:space="preserve">C. Haftalık Program</w:t>
+        <w:t xml:space="preserve">C. Weekly Schedule</w:t>
       </w:r>
     </w:p>
     <w:p>
@@ -1915,7 +1909,7 @@
         <w:pStyle w:val="FirstParagraph"/>
       </w:pPr>
       <w:r>
-        <w:t xml:space="preserve">Bütün değerlendirmeler için kural:</w:t>
+        <w:t xml:space="preserve">Rule for all assessments:</w:t>
       </w:r>
       <w:r>
         <w:t xml:space="preserve"> </w:t>
@@ -1925,7 +1919,7 @@
           <w:b/>
           <w:bCs/>
         </w:rPr>
-        <w:t xml:space="preserve">proje gösterimleri vize ve final haftalarının hemen öncesindeki haftada; quizler</w:t>
+        <w:t xml:space="preserve">project demonstrations take place in the week just before the midterm and final exam</w:t>
       </w:r>
       <w:r>
         <w:rPr>
@@ -1939,13 +1933,19 @@
           <w:b/>
           <w:bCs/>
         </w:rPr>
-        <w:t xml:space="preserve">vize ve final haftalarının içinde</w:t>
-      </w:r>
-      <w:r>
-        <w:t xml:space="preserve"> </w:t>
-      </w:r>
-      <w:r>
-        <w:t xml:space="preserve">yapılır, böylece her öğrenci katılabilir. Konular ritimdeki sırayla işlenir.</w:t>
+        <w:t xml:space="preserve">weeks; quizzes take place inside the midterm and final exam weeks</w:t>
+      </w:r>
+      <w:r>
+        <w:t xml:space="preserve"> </w:t>
+      </w:r>
+      <w:r>
+        <w:t xml:space="preserve">so that every student can attend. Topics follow</w:t>
+      </w:r>
+      <w:r>
+        <w:t xml:space="preserve"> </w:t>
+      </w:r>
+      <w:r>
+        <w:t xml:space="preserve">the order defined in ritim.</w:t>
       </w:r>
     </w:p>
     <w:tbl>
@@ -1972,40 +1972,40 @@
               <w:pStyle w:val="Compact"/>
             </w:pPr>
             <w:r>
-              <w:t xml:space="preserve">Hafta</w:t>
-            </w:r>
-          </w:p>
-        </w:tc>
-        <w:tc>
-          <w:tcPr/>
-          <w:p>
-            <w:pPr>
-              <w:pStyle w:val="Compact"/>
-            </w:pPr>
-            <w:r>
-              <w:t xml:space="preserve">Tarih</w:t>
-            </w:r>
-          </w:p>
-        </w:tc>
-        <w:tc>
-          <w:tcPr/>
-          <w:p>
-            <w:pPr>
-              <w:pStyle w:val="Compact"/>
-            </w:pPr>
-            <w:r>
-              <w:t xml:space="preserve">Konular</w:t>
-            </w:r>
-          </w:p>
-        </w:tc>
-        <w:tc>
-          <w:tcPr/>
-          <w:p>
-            <w:pPr>
-              <w:pStyle w:val="Compact"/>
-            </w:pPr>
-            <w:r>
-              <w:t xml:space="preserve">ÖÇ</w:t>
+              <w:t xml:space="preserve">Week</w:t>
+            </w:r>
+          </w:p>
+        </w:tc>
+        <w:tc>
+          <w:tcPr/>
+          <w:p>
+            <w:pPr>
+              <w:pStyle w:val="Compact"/>
+            </w:pPr>
+            <w:r>
+              <w:t xml:space="preserve">Date</w:t>
+            </w:r>
+          </w:p>
+        </w:tc>
+        <w:tc>
+          <w:tcPr/>
+          <w:p>
+            <w:pPr>
+              <w:pStyle w:val="Compact"/>
+            </w:pPr>
+            <w:r>
+              <w:t xml:space="preserve">Topics</w:t>
+            </w:r>
+          </w:p>
+        </w:tc>
+        <w:tc>
+          <w:tcPr/>
+          <w:p>
+            <w:pPr>
+              <w:pStyle w:val="Compact"/>
+            </w:pPr>
+            <w:r>
+              <w:t xml:space="preserve">LO</w:t>
             </w:r>
           </w:p>
         </w:tc>
@@ -2029,18 +2029,18 @@
               <w:pStyle w:val="Compact"/>
             </w:pPr>
             <w:r>
-              <w:t xml:space="preserve">18.09.2026 (telafi 30.09)</w:t>
-            </w:r>
-          </w:p>
-        </w:tc>
-        <w:tc>
-          <w:tcPr/>
-          <w:p>
-            <w:pPr>
-              <w:pStyle w:val="Compact"/>
-            </w:pPr>
-            <w:r>
-              <w:t xml:space="preserve">Ders planı ve iletişim. Güvenli programlamaya giriş: güvenlik hedefleri (gizlilik, bütünlük, erişilebilirlik), saldırgan modeli, tehdit modelleme (saldırı ağaçları, STRIDE). Uygulama korumasına genel bakış; arabellek taşmaları ve önleme teknikleri; bellek yönetimi ve güvenlik; korunan kod bölümleme ve şifreleme ile güvenli işleme. Uygulama koruma planının hazırlanması.</w:t>
+              <w:t xml:space="preserve">18.09.2026 (make-up 30.09)</w:t>
+            </w:r>
+          </w:p>
+        </w:tc>
+        <w:tc>
+          <w:tcPr/>
+          <w:p>
+            <w:pPr>
+              <w:pStyle w:val="Compact"/>
+            </w:pPr>
+            <w:r>
+              <w:t xml:space="preserve">Course plan and communication. Introduction to secure programming: security goals (confidentiality, integrity, availability), attacker model, threat modelling (attack trees, STRIDE). Overview of application protection; buffer overflows and prevention techniques; memory management and security; secure processing with protected code partitioning and encryption. Preparing an application protection plan.</w:t>
             </w:r>
           </w:p>
         </w:tc>
@@ -2086,7 +2086,7 @@
               <w:pStyle w:val="Compact"/>
             </w:pPr>
             <w:r>
-              <w:t xml:space="preserve">Bilgisayar virüsleri ve zararlı yazılımlar: virüs türleri (program, makro, önyükleme sektörü), solucanlar ve truva atları; virüslere karşı önlemler. Saldırı ağaçları ve güvenlik modelleri (Bell–LaPadula, Biba, Clark–Wilson). Yazılım güvenlik açıklarının sınıflandırılması: CWE ve CWE Top 25, OWASP Top 10, CVE ve CVSS.</w:t>
+              <w:t xml:space="preserve">Computer viruses and malware: virus types (program, macro, boot sector), worms and trojans; countermeasures against viruses. Attack trees and security models (Bell–LaPadula, Biba, Clark–Wilson). Classifying software vulnerabilities: CWE and the CWE Top 25, OWASP Top 10, CVE and CVSS.</w:t>
             </w:r>
           </w:p>
         </w:tc>
@@ -2132,7 +2132,7 @@
               <w:pStyle w:val="Compact"/>
             </w:pPr>
             <w:r>
-              <w:t xml:space="preserve">Veri güvenliği: aktarımda, beklemede ve kullanımda. Şifreleme temelleri (simetrik/asimetrik, özet fonksiyonları, kimlik doğrulamalı şifreleme); SSL/TLS kullanımı ve TLS 1.3 el sıkışması; sertifika sabitleme; whitebox kriptografi uygulamalarına giriş; dinamik anahtar yönetimi ve oturum anahtarları; veri maskeleme teknikleri; bellekteki hassas verinin güvenli silinmesi.</w:t>
+              <w:t xml:space="preserve">Data security: in transit, at rest and in use. Encryption basics (symmetric/asymmetric, hash functions, authenticated encryption); using SSL/TLS and the TLS 1.3 handshake; certificate pinning; introduction to white-box cryptography applications; dynamic key management and session keys; data masking techniques; secure erasure of sensitive data in memory.</w:t>
             </w:r>
           </w:p>
         </w:tc>
@@ -2178,7 +2178,7 @@
               <w:pStyle w:val="Compact"/>
             </w:pPr>
             <w:r>
-              <w:t xml:space="preserve">Kod sağlamlaştırma (C/C++): güvenli bellek yönetimi ve güvenli kodlama kuralları (SEI CERT C/C++); arabellek taşması, serbest bırakılmış belleğin kullanımı (use-after-free) ve tamsayı taşması örnekleri; sanitizer’lar (AddressSanitizer, UndefinedBehaviorSanitizer) ve fuzzing’e giriş; derleyici ve işletim sistemi korumaları (stack canary, ASLR, DEP/NX, CFI, SafeStack); kontrol akışı düzleştirme; fonksiyon adı gizleme; bellek tahsisi gizleme; dinamik şifreleme teknikleri.</w:t>
+              <w:t xml:space="preserve">Code hardening (C/C++): secure memory management and secure coding rules (SEI CERT C/C++); buffer overflow, use-after-free and integer overflow examples; sanitizers (AddressSanitizer, UndefinedBehaviorSanitizer) and an introduction to fuzzing; compiler and operating system protections (stack canaries, ASLR, DEP/NX, CFI, SafeStack); control flow flattening; function name obfuscation; memory allocation obfuscation; dynamic encryption techniques.</w:t>
             </w:r>
           </w:p>
         </w:tc>
@@ -2224,7 +2224,7 @@
               <w:pStyle w:val="Compact"/>
             </w:pPr>
             <w:r>
-              <w:t xml:space="preserve">Kod sağlamlaştırma (Java/yorumlanan diller): girdi doğrulama ve enjeksiyon saldırılarına karşı savunma (SQL, komut, yol geçişi; parametreli sorgular; SEI CERT Oracle Java); ProGuard ve R8 ile kod gizleme; dinamik yöntem gizleme; statik dize gizleme ve koruma; gelişmiş ProGuard kuralları; bağımlılık güvenliği ve yazılım malzeme listesi (SBOM).</w:t>
+              <w:t xml:space="preserve">Code hardening (Java/interpreted languages): input validation and defence against injection attacks (SQL, command, path traversal; parameterised queries; SEI CERT Oracle Java); code obfuscation with ProGuard and R8; dynamic method obfuscation; static string obfuscation and protection; advanced ProGuard rules; dependency security and the software bill of materials (SBOM).</w:t>
             </w:r>
           </w:p>
         </w:tc>
@@ -2270,7 +2270,7 @@
               <w:pStyle w:val="Compact"/>
             </w:pPr>
             <w:r>
-              <w:t xml:space="preserve">Çalışma zamanı uygulama öz koruması (RASP) (C/C++): root ve emülatör algılama; APK imza doğrulaması; çalışma zamanında kod bloğu bütünlüğü (checksum) kontrolü; hata ayıklayıcı algılama ve bağlanmayı engelleme; kanca (hook) saldırısı algılama; dinamik bellek koruması ve bellek izleme tespiti; dinamik analiz araçlarına karşı koruma; müdahale algılandığında verilecek yanıtlar.</w:t>
+              <w:t xml:space="preserve">Runtime application self-protection (RASP) (C/C++): root and emulator detection; APK signature verification; runtime code block integrity (checksum) checks; debugger detection and attach prevention; hook attack detection; dynamic memory protection and memory monitoring detection; protection against dynamic analysis tools; responses when tampering is detected.</w:t>
             </w:r>
           </w:p>
         </w:tc>
@@ -2320,13 +2320,13 @@
                 <w:b/>
                 <w:bCs/>
               </w:rPr>
-              <w:t xml:space="preserve">Ara proje gösterimleri</w:t>
+              <w:t xml:space="preserve">Midterm project demonstrations</w:t>
             </w:r>
             <w:r>
               <w:t xml:space="preserve"> </w:t>
             </w:r>
             <w:r>
-              <w:t xml:space="preserve">ve ara proje raporu teslimi.</w:t>
+              <w:t xml:space="preserve">and midterm project report submission.</w:t>
             </w:r>
           </w:p>
         </w:tc>
@@ -2376,13 +2376,13 @@
                 <w:b/>
                 <w:bCs/>
               </w:rPr>
-              <w:t xml:space="preserve">Ara sınav haftası — Quiz-1</w:t>
+              <w:t xml:space="preserve">Midterm exam week — Quiz-1</w:t>
             </w:r>
             <w:r>
               <w:t xml:space="preserve"> </w:t>
             </w:r>
             <w:r>
-              <w:t xml:space="preserve">(1–6. haftalar).</w:t>
+              <w:t xml:space="preserve">(weeks 1–6).</w:t>
             </w:r>
           </w:p>
         </w:tc>
@@ -2428,7 +2428,7 @@
               <w:pStyle w:val="Compact"/>
             </w:pPr>
             <w:r>
-              <w:t xml:space="preserve">Gelişmiş kod gizleme ve çeşitlendirme: dinamik kontrol akışı gizleme; opak yüklemler (opaque predicates), sahte kontrol akışları ve ölü kod ekleme; program gizleme teknikleri (veri kodlama, sanallaştırma tabanlı gizleme); dinamik fonksiyon çağrıları ve çalışma zamanı optimizasyonları; gizlemenin etkinliğinin ölçülmesi (güç, dayanıklılık, maliyet).</w:t>
+              <w:t xml:space="preserve">Advanced code obfuscation and diversification: dynamic control flow obfuscation; opaque predicates, bogus control flow and dead code insertion; program obfuscation techniques (data encoding, virtualisation-based obfuscation); dynamic function calls and runtime optimisations; measuring obfuscation (potency, resilience, cost).</w:t>
             </w:r>
           </w:p>
         </w:tc>
@@ -2474,7 +2474,7 @@
               <w:pStyle w:val="Compact"/>
             </w:pPr>
             <w:r>
-              <w:t xml:space="preserve">Sertifikalar ve kriptografik yöntemler (AES, RSA, PKI): AES ve RSA şifrelemesi, çalışma kipleri ve dolgu; HMAC ile veri bütünlüğü; dijital imza oluşturma ve doğrulama; PKI bileşenleri (CA, RA, sertifika zinciri); X.509 sertifika oluşturma (OpenSSL); sertifika iptali (CRL, OCSP); anahtar dağıtım problemi.</w:t>
+              <w:t xml:space="preserve">Certificates and cryptographic methods (AES, RSA, PKI): AES and RSA encryption, modes of operation and padding; data integrity with HMAC; creating and verifying digital signatures; PKI components (CA, RA, certificate chain); creating X.509 certificates (OpenSSL); certificate revocation (CRL, OCSP); the key distribution problem.</w:t>
             </w:r>
           </w:p>
         </w:tc>
@@ -2520,7 +2520,7 @@
               <w:pStyle w:val="Compact"/>
             </w:pPr>
             <w:r>
-              <w:t xml:space="preserve">Whitebox kriptografi: beyaz kutu ve kara kutu saldırgan modelleri; whitebox AES ve DES uygulamaları (tablo tabanlı gerçekleştirim); whitebox kriptografi ile anahtar koruması; bilinen saldırılar (diferansiyel hesaplama ve hata analizi) ve karşı önlemler; yazılım tabanlı güvenlik çözümleri (ör. SoftHSM ile yazılımsal güvenlik modülü).</w:t>
+              <w:t xml:space="preserve">White-box cryptography: white-box and black-box attacker models; white-box AES and DES implementations (table-based); key protection with white-box cryptography; known attacks (differential computation and fault analysis) and countermeasures; software-based security solutions (e.g. a software security module with SoftHSM).</w:t>
             </w:r>
           </w:p>
         </w:tc>
@@ -2566,7 +2566,7 @@
               <w:pStyle w:val="Compact"/>
             </w:pPr>
             <w:r>
-              <w:t xml:space="preserve">Güvenlik sertifikasyonları ve sızma testi planlaması: ETSI ve EMV güvenlik standartları; PCI DSS ve ISO/IEC 27001 kapsamındaki güvenlik testleri; güvenlik incelemesi ve zafiyet değerlendirme (kod incelemesi, statik ve dinamik analiz, fuzzing); sızma testi planı: kapsam, kurallar, yöntem (OWASP WSTG ve MASTG, PTES) ve raporlama.</w:t>
+              <w:t xml:space="preserve">Security certifications and penetration test planning: ETSI and EMV security standards; security testing under PCI DSS and ISO/IEC 27001; security review and vulnerability assessment (code review, static and dynamic analysis, fuzzing); penetration test plan: scope, rules of engagement, methodology (OWASP WSTG and MASTG, PTES) and reporting.</w:t>
             </w:r>
           </w:p>
         </w:tc>
@@ -2612,7 +2612,7 @@
               <w:pStyle w:val="Compact"/>
             </w:pPr>
             <w:r>
-              <w:t xml:space="preserve">Güvenlik gereksinimleri: ETSI, GSMA ve EMV güvenlik gereksinimleri; Ortak Kriterler (ISO/IEC 15408) ve EAL düzeyleri; FIPS 140-3 gereksinimleri; gereksinimlerin yazılım planına ve varlık yönetimine aktarılması.</w:t>
+              <w:t xml:space="preserve">Security requirements: ETSI, GSMA and EMV security requirements; Common Criteria (ISO/IEC 15408) and EAL levels; FIPS 140-3 requirements; turning requirements into the software plan and asset management.</w:t>
             </w:r>
           </w:p>
         </w:tc>
@@ -2658,7 +2658,7 @@
               <w:pStyle w:val="Compact"/>
             </w:pPr>
             <w:r>
-              <w:t xml:space="preserve">Tigress ve çeşitlendirme: Tigress ile C kaynak kodu dönüşümleri (kontrol akışı düzleştirme, sanallaştırma, sabit ve aritmetik kodlama, opak yüklemler, fonksiyon bölme ve birleştirme); gizleme yöntemlerinin birleştirilmesi; çeşitlendirme ile her kopya için farklı ikili; saldırılara karşı savunma ve gizlenmiş kodun analize dayanıklılığının değerlendirilmesi.</w:t>
+              <w:t xml:space="preserve">Tigress and diversification: C source transformations with Tigress (control flow flattening, virtualisation, literal and arithmetic encoding, opaque predicates, function split and merge); combining obfuscation methods; diversification to produce a different binary for each copy; defending against attacks and evaluating how well obfuscated code resists analysis.</w:t>
             </w:r>
           </w:p>
         </w:tc>
@@ -2708,13 +2708,13 @@
                 <w:b/>
                 <w:bCs/>
               </w:rPr>
-              <w:t xml:space="preserve">Final proje gösterimleri</w:t>
+              <w:t xml:space="preserve">Final project demonstrations</w:t>
             </w:r>
             <w:r>
               <w:t xml:space="preserve"> </w:t>
             </w:r>
             <w:r>
-              <w:t xml:space="preserve">ve final proje raporu teslimi.</w:t>
+              <w:t xml:space="preserve">and final project report submission.</w:t>
             </w:r>
           </w:p>
         </w:tc>
@@ -2764,13 +2764,13 @@
                 <w:b/>
                 <w:bCs/>
               </w:rPr>
-              <w:t xml:space="preserve">Final sınav dönemi — Quiz-2</w:t>
+              <w:t xml:space="preserve">Final exam period — Quiz-2</w:t>
             </w:r>
             <w:r>
               <w:t xml:space="preserve"> </w:t>
             </w:r>
             <w:r>
-              <w:t xml:space="preserve">(9–14. haftalar).</w:t>
+              <w:t xml:space="preserve">(weeks 9–14).</w:t>
             </w:r>
           </w:p>
         </w:tc>
@@ -2792,19 +2792,19 @@
         <w:pStyle w:val="BodyText"/>
       </w:pPr>
       <w:r>
-        <w:t xml:space="preserve">Ders notlarında isteğe bağlı okuma olarak işlenecek zenginleştirme konuları: bellek güvenli diller (Rust) ve C/C++</w:t>
-      </w:r>
-      <w:r>
-        <w:t xml:space="preserve"> </w:t>
-      </w:r>
-      <w:r>
-        <w:t xml:space="preserve">ile birlikte kullanımı, güvenli yazılım geliştirme yaşam döngüsü (NIST SSDF), yan kanal saldırılarına giriş, tersine</w:t>
-      </w:r>
-      <w:r>
-        <w:t xml:space="preserve"> </w:t>
-      </w:r>
-      <w:r>
-        <w:t xml:space="preserve">mühendislik araçlarıyla (Ghidra) gizlenmiş kodun incelenmesi.</w:t>
+        <w:t xml:space="preserve">Enrichment topics covered in the course notes as optional reading: memory-safe languages (Rust) and their use</w:t>
+      </w:r>
+      <w:r>
+        <w:t xml:space="preserve"> </w:t>
+      </w:r>
+      <w:r>
+        <w:t xml:space="preserve">alongside C/C++, the secure software development life cycle (NIST SSDF), an introduction to side-channel attacks,</w:t>
+      </w:r>
+      <w:r>
+        <w:t xml:space="preserve"> </w:t>
+      </w:r>
+      <w:r>
+        <w:t xml:space="preserve">and examining obfuscated code with reverse engineering tools (Ghidra).</w:t>
       </w:r>
     </w:p>
     <w:p>
@@ -2815,13 +2815,13 @@
       </w:r>
     </w:p>
     <w:bookmarkEnd w:id="27"/>
-    <w:bookmarkStart w:id="28" w:name="d.-kaynaklar-yazılım-ve-donanım"/>
+    <w:bookmarkStart w:id="28" w:name="d.-textbooks-software-and-equipment"/>
     <w:p>
       <w:pPr>
         <w:pStyle w:val="Heading2"/>
       </w:pPr>
       <w:r>
-        <w:t xml:space="preserve">D. Kaynaklar, Yazılım ve Donanım</w:t>
+        <w:t xml:space="preserve">D. Textbooks, Software and Equipment</w:t>
       </w:r>
     </w:p>
     <w:p>
@@ -2829,19 +2829,19 @@
         <w:pStyle w:val="FirstParagraph"/>
       </w:pPr>
       <w:r>
-        <w:t xml:space="preserve">Ana kaynak, ders web sitesindeki ders notlarıdır ve kendi başına yeterlidir. Notlar aşağıdaki ders kitabının</w:t>
-      </w:r>
-      <w:r>
-        <w:t xml:space="preserve"> </w:t>
-      </w:r>
-      <w:r>
-        <w:t xml:space="preserve">tarifleri ile öğretim üyesinin yazılım koruma ve güvenlik sertifikasyonu alanında geliştirdiği kod koruma ve</w:t>
-      </w:r>
-      <w:r>
-        <w:t xml:space="preserve"> </w:t>
-      </w:r>
-      <w:r>
-        <w:t xml:space="preserve">güvenlik yöntemleri üzerine kuruludur; bu yöntemler ilgili haftaların konuları içinde işlenir.</w:t>
+        <w:t xml:space="preserve">The course notes on the course website are the main resource and are self-contained. The notes are built on the</w:t>
+      </w:r>
+      <w:r>
+        <w:t xml:space="preserve"> </w:t>
+      </w:r>
+      <w:r>
+        <w:t xml:space="preserve">recipes of the textbook below and on the code protection and security methods the instructor developed in</w:t>
+      </w:r>
+      <w:r>
+        <w:t xml:space="preserve"> </w:t>
+      </w:r>
+      <w:r>
+        <w:t xml:space="preserve">software protection and security certification; these methods are taught within the related weeks.</w:t>
       </w:r>
     </w:p>
     <w:p>
@@ -2853,7 +2853,7 @@
           <w:b/>
           <w:bCs/>
         </w:rPr>
-        <w:t xml:space="preserve">Ders kitabı:</w:t>
+        <w:t xml:space="preserve">Textbook:</w:t>
       </w:r>
     </w:p>
     <w:p>
@@ -2878,19 +2878,19 @@
         <w:t xml:space="preserve">Secure Programming Cookbook for C and C++</w:t>
       </w:r>
       <w:r>
-        <w:t xml:space="preserve">. O’Reilly, 2003. — Kitaptaki kavramlar ve hata</w:t>
-      </w:r>
-      <w:r>
-        <w:t xml:space="preserve"> </w:t>
-      </w:r>
-      <w:r>
-        <w:t xml:space="preserve">desenleri bugün de geçerlidir; 2003 tarihli API ve algoritmaların güncel karşılıkları (OpenSSL 3, TLS 1.3, AES-GCM,</w:t>
-      </w:r>
-      <w:r>
-        <w:t xml:space="preserve"> </w:t>
-      </w:r>
-      <w:r>
-        <w:t xml:space="preserve">Argon2id vb.) ders notlarında verilir.</w:t>
+        <w:t xml:space="preserve">. O’Reilly, 2003. — The book’s concepts and error</w:t>
+      </w:r>
+      <w:r>
+        <w:t xml:space="preserve"> </w:t>
+      </w:r>
+      <w:r>
+        <w:t xml:space="preserve">patterns still hold; up-to-date replacements for its 2003 APIs and algorithms (OpenSSL 3, TLS 1.3, AES-GCM,</w:t>
+      </w:r>
+      <w:r>
+        <w:t xml:space="preserve"> </w:t>
+      </w:r>
+      <w:r>
+        <w:t xml:space="preserve">Argon2id, etc.) are given in the course notes.</w:t>
       </w:r>
     </w:p>
     <w:p>
@@ -2902,7 +2902,7 @@
           <w:b/>
           <w:bCs/>
         </w:rPr>
-        <w:t xml:space="preserve">Ritimde tanımlı diğer kaynaklar:</w:t>
+        <w:t xml:space="preserve">Other resources defined in ritim:</w:t>
       </w:r>
     </w:p>
     <w:p>
@@ -2927,7 +2927,7 @@
         <w:t xml:space="preserve">C How to Program</w:t>
       </w:r>
       <w:r>
-        <w:t xml:space="preserve">, 7. baskı. Prentice Hall, 2013.</w:t>
+        <w:t xml:space="preserve">, 7th ed. Prentice Hall, 2013.</w:t>
       </w:r>
     </w:p>
     <w:p>
@@ -2952,7 +2952,7 @@
         <w:t xml:space="preserve">Introduction to Algorithms</w:t>
       </w:r>
       <w:r>
-        <w:t xml:space="preserve">, 3. baskı. MIT Press.</w:t>
+        <w:t xml:space="preserve">, 3rd ed. MIT Press.</w:t>
       </w:r>
     </w:p>
     <w:p>
@@ -2989,7 +2989,7 @@
           <w:b/>
           <w:bCs/>
         </w:rPr>
-        <w:t xml:space="preserve">İleri okuma:</w:t>
+        <w:t xml:space="preserve">Further reading:</w:t>
       </w:r>
     </w:p>
     <w:p>
@@ -3014,7 +3014,7 @@
         <w:t xml:space="preserve">Secure Coding in C and C++</w:t>
       </w:r>
       <w:r>
-        <w:t xml:space="preserve">, 2. baskı. Addison-Wesley, 2013.</w:t>
+        <w:t xml:space="preserve">, 2nd ed. Addison-Wesley, 2013.</w:t>
       </w:r>
     </w:p>
     <w:p>
@@ -3103,7 +3103,7 @@
         <w:t xml:space="preserve">Security Engineering</w:t>
       </w:r>
       <w:r>
-        <w:t xml:space="preserve">, 3. baskı. Wiley, 2020.</w:t>
+        <w:t xml:space="preserve">, 3rd ed. Wiley, 2020.</w:t>
       </w:r>
     </w:p>
     <w:p>
@@ -3128,7 +3128,7 @@
         <w:t xml:space="preserve">Serious Cryptography</w:t>
       </w:r>
       <w:r>
-        <w:t xml:space="preserve">, 2. baskı. No Starch Press, 2024.</w:t>
+        <w:t xml:space="preserve">, 2nd ed. No Starch Press, 2024.</w:t>
       </w:r>
     </w:p>
     <w:p>
@@ -3140,13 +3140,13 @@
         </w:numPr>
       </w:pPr>
       <w:r>
-        <w:t xml:space="preserve">Açık erişimli standartlar: SEI CERT C/C++ ve Oracle Java güvenli kodlama standartları, OWASP Top 10, ASVS, MASVS</w:t>
-      </w:r>
-      <w:r>
-        <w:t xml:space="preserve"> </w:t>
-      </w:r>
-      <w:r>
-        <w:t xml:space="preserve">ve MASTG, MITRE CWE, NIST FIPS 140-3.</w:t>
+        <w:t xml:space="preserve">Open standards: SEI CERT C/C++ and Oracle Java secure coding standards, OWASP Top 10, ASVS, MASVS and MASTG,</w:t>
+      </w:r>
+      <w:r>
+        <w:t xml:space="preserve"> </w:t>
+      </w:r>
+      <w:r>
+        <w:t xml:space="preserve">MITRE CWE, NIST FIPS 140-3.</w:t>
       </w:r>
     </w:p>
     <w:p>
@@ -3158,31 +3158,37 @@
           <w:b/>
           <w:bCs/>
         </w:rPr>
-        <w:t xml:space="preserve">Dizüstü bilgisayar gereklidir.</w:t>
-      </w:r>
-      <w:r>
-        <w:t xml:space="preserve"> </w:t>
-      </w:r>
-      <w:r>
-        <w:t xml:space="preserve">Derste ve projede kendi geliştirme ortamınızı kullanacaksınız: C/C++ derleyicisi</w:t>
-      </w:r>
-      <w:r>
-        <w:t xml:space="preserve"> </w:t>
-      </w:r>
-      <w:r>
-        <w:t xml:space="preserve">(GCC, Clang ya da MSVC), CMake, GoogleTest, OpenSSL 3, SQLite, SoftHSM2, JDK 21 ile ProGuard/R8, Tigress (Linux;</w:t>
-      </w:r>
-      <w:r>
-        <w:t xml:space="preserve"> </w:t>
-      </w:r>
-      <w:r>
-        <w:t xml:space="preserve">Windows’ta WSL2 ya da Docker ile), Git ve bir GitHub hesabı. Android konuları için Android Studio (SDK ve NDK) ile</w:t>
-      </w:r>
-      <w:r>
-        <w:t xml:space="preserve"> </w:t>
-      </w:r>
-      <w:r>
-        <w:t xml:space="preserve">emülatör önerilir. Kurulum adımları 1. haftada ve ders notlarında verilir; proje şablonları sağlanır.</w:t>
+        <w:t xml:space="preserve">Laptop required.</w:t>
+      </w:r>
+      <w:r>
+        <w:t xml:space="preserve"> </w:t>
+      </w:r>
+      <w:r>
+        <w:t xml:space="preserve">You will use your own development environment in class and in the project: a C/C++ compiler</w:t>
+      </w:r>
+      <w:r>
+        <w:t xml:space="preserve"> </w:t>
+      </w:r>
+      <w:r>
+        <w:t xml:space="preserve">(GCC, Clang or MSVC), CMake, GoogleTest, OpenSSL 3, SQLite, SoftHSM2, JDK 21 with ProGuard/R8, Tigress (Linux; on</w:t>
+      </w:r>
+      <w:r>
+        <w:t xml:space="preserve"> </w:t>
+      </w:r>
+      <w:r>
+        <w:t xml:space="preserve">Windows through WSL2 or Docker), and Git with a GitHub account. For the Android topics, Android Studio (SDK and NDK)</w:t>
+      </w:r>
+      <w:r>
+        <w:t xml:space="preserve"> </w:t>
+      </w:r>
+      <w:r>
+        <w:t xml:space="preserve">with an emulator is recommended. Installation steps are given in week 1 and in the course notes; project templates are</w:t>
+      </w:r>
+      <w:r>
+        <w:t xml:space="preserve"> </w:t>
+      </w:r>
+      <w:r>
+        <w:t xml:space="preserve">provided.</w:t>
       </w:r>
     </w:p>
     <w:p>
@@ -3193,13 +3199,13 @@
       </w:r>
     </w:p>
     <w:bookmarkEnd w:id="28"/>
-    <w:bookmarkStart w:id="30" w:name="e.-değerlendirme"/>
+    <w:bookmarkStart w:id="30" w:name="e.-assessment"/>
     <w:p>
       <w:pPr>
         <w:pStyle w:val="Heading2"/>
       </w:pPr>
       <w:r>
-        <w:t xml:space="preserve">E. Değerlendirme</w:t>
+        <w:t xml:space="preserve">E. Assessment</w:t>
       </w:r>
     </w:p>
     <w:p>
@@ -3207,7 +3213,7 @@
         <w:pStyle w:val="FirstParagraph"/>
       </w:pPr>
       <w:r>
-        <w:t xml:space="preserve">Dönem boyunca</w:t>
+        <w:t xml:space="preserve">You carry out</w:t>
       </w:r>
       <w:r>
         <w:t xml:space="preserve"> </w:t>
@@ -3217,37 +3223,34 @@
           <w:b/>
           <w:bCs/>
         </w:rPr>
-        <w:t xml:space="preserve">tek bir proje</w:t>
-      </w:r>
-      <w:r>
-        <w:t xml:space="preserve"> </w:t>
-      </w:r>
-      <w:r>
-        <w:t xml:space="preserve">yürütülür: seçilen bir konu üzerinde, güvenlik gereksinimlerini karşılayan ve bir</w:t>
-      </w:r>
-      <w:r>
-        <w:t xml:space="preserve"> </w:t>
-      </w:r>
-      <w:r>
-        <w:t xml:space="preserve">sertifikasyon sürecinden geçiyormuş gibi tasarlanan bir C/C++ uygulaması. Projeler bireysel olarak ya da en fazla 4</w:t>
-      </w:r>
-      <w:r>
-        <w:t xml:space="preserve"> </w:t>
-      </w:r>
-      <w:r>
-        <w:t xml:space="preserve">kişilik takımlarla yapılır; geliştirmeye başlamadan önce GitHub’da proje planı hazırlanıp onaylatılır. Projenin her</w:t>
-      </w:r>
-      <w:r>
-        <w:t xml:space="preserve"> </w:t>
-      </w:r>
-      <w:r>
-        <w:t xml:space="preserve">biri kendi rubriğiyle değerlendirilen iki ara kontrolü vardır: vize kontrolü ve final kontrolü. Ayrıca ara sınav</w:t>
-      </w:r>
-      <w:r>
-        <w:t xml:space="preserve"> </w:t>
-      </w:r>
-      <w:r>
-        <w:t xml:space="preserve">haftasında bir, final döneminde bir quiz yapılır. Proje konuları, gereksinimler, teslimler ve</w:t>
+        <w:t xml:space="preserve">one term project</w:t>
+      </w:r>
+      <w:r>
+        <w:t xml:space="preserve">: a C/C++ application on a chosen topic that meets security requirements and is</w:t>
+      </w:r>
+      <w:r>
+        <w:t xml:space="preserve"> </w:t>
+      </w:r>
+      <w:r>
+        <w:t xml:space="preserve">designed as if it were going through a certification process. Projects are done individually or in teams of at most</w:t>
+      </w:r>
+      <w:r>
+        <w:t xml:space="preserve"> </w:t>
+      </w:r>
+      <w:r>
+        <w:t xml:space="preserve">4 students; a project plan is prepared on GitHub and approved before development starts. The project has two</w:t>
+      </w:r>
+      <w:r>
+        <w:t xml:space="preserve"> </w:t>
+      </w:r>
+      <w:r>
+        <w:t xml:space="preserve">checkpoints, each evaluated with its rubric: a midterm checkpoint and a final checkpoint. You also take one quiz in the</w:t>
+      </w:r>
+      <w:r>
+        <w:t xml:space="preserve"> </w:t>
+      </w:r>
+      <w:r>
+        <w:t xml:space="preserve">midterm exam week and one quiz in the final exam period. The project topics, requirements, deliverables and the</w:t>
       </w:r>
       <w:r>
         <w:t xml:space="preserve"> </w:t>
@@ -3257,27 +3260,19 @@
           <w:b/>
           <w:bCs/>
         </w:rPr>
-        <w:t xml:space="preserve">ayrıntılı vize ve final</w:t>
-      </w:r>
-      <w:r>
-        <w:rPr>
-          <w:b/>
-          <w:bCs/>
-        </w:rPr>
-        <w:t xml:space="preserve"> </w:t>
-      </w:r>
-      <w:r>
-        <w:rPr>
-          <w:b/>
-          <w:bCs/>
-        </w:rPr>
-        <w:t xml:space="preserve">rubrikleri</w:t>
-      </w:r>
-      <w:r>
-        <w:t xml:space="preserve"> </w:t>
-      </w:r>
-      <w:r>
-        <w:t xml:space="preserve">(kriterler, puanlar, ilişkili öğrenme çıktıları ve başarı düzeyleri) dersin proje rehberinde verilir.</w:t>
+        <w:t xml:space="preserve">detailed midterm and final rubrics</w:t>
+      </w:r>
+      <w:r>
+        <w:t xml:space="preserve"> </w:t>
+      </w:r>
+      <w:r>
+        <w:t xml:space="preserve">(criteria, points, related learning outcomes and performance levels) are given</w:t>
+      </w:r>
+      <w:r>
+        <w:t xml:space="preserve"> </w:t>
+      </w:r>
+      <w:r>
+        <w:t xml:space="preserve">in the course’s project guide.</w:t>
       </w:r>
     </w:p>
     <w:tbl>
@@ -3304,40 +3299,40 @@
               <w:pStyle w:val="Compact"/>
             </w:pPr>
             <w:r>
-              <w:t xml:space="preserve">Değerlendirme</w:t>
-            </w:r>
-          </w:p>
-        </w:tc>
-        <w:tc>
-          <w:tcPr/>
-          <w:p>
-            <w:pPr>
-              <w:pStyle w:val="Compact"/>
-            </w:pPr>
-            <w:r>
-              <w:t xml:space="preserve">Kod</w:t>
-            </w:r>
-          </w:p>
-        </w:tc>
-        <w:tc>
-          <w:tcPr/>
-          <w:p>
-            <w:pPr>
-              <w:pStyle w:val="Compact"/>
-            </w:pPr>
-            <w:r>
-              <w:t xml:space="preserve">Ağırlık</w:t>
-            </w:r>
-          </w:p>
-        </w:tc>
-        <w:tc>
-          <w:tcPr/>
-          <w:p>
-            <w:pPr>
-              <w:pStyle w:val="Compact"/>
-            </w:pPr>
-            <w:r>
-              <w:t xml:space="preserve">Zaman</w:t>
+              <w:t xml:space="preserve">Assessment</w:t>
+            </w:r>
+          </w:p>
+        </w:tc>
+        <w:tc>
+          <w:tcPr/>
+          <w:p>
+            <w:pPr>
+              <w:pStyle w:val="Compact"/>
+            </w:pPr>
+            <w:r>
+              <w:t xml:space="preserve">Code</w:t>
+            </w:r>
+          </w:p>
+        </w:tc>
+        <w:tc>
+          <w:tcPr/>
+          <w:p>
+            <w:pPr>
+              <w:pStyle w:val="Compact"/>
+            </w:pPr>
+            <w:r>
+              <w:t xml:space="preserve">Weight</w:t>
+            </w:r>
+          </w:p>
+        </w:tc>
+        <w:tc>
+          <w:tcPr/>
+          <w:p>
+            <w:pPr>
+              <w:pStyle w:val="Compact"/>
+            </w:pPr>
+            <w:r>
+              <w:t xml:space="preserve">When</w:t>
             </w:r>
           </w:p>
         </w:tc>
@@ -3350,7 +3345,7 @@
               <w:pStyle w:val="Compact"/>
             </w:pPr>
             <w:r>
-              <w:t xml:space="preserve">Proje kontrolü 1 — ara rapor ve gösterim (rubrik)</w:t>
+              <w:t xml:space="preserve">Project checkpoint 1 — midterm report and demonstration (rubric)</w:t>
             </w:r>
           </w:p>
         </w:tc>
@@ -3372,18 +3367,18 @@
               <w:pStyle w:val="Compact"/>
             </w:pPr>
             <w:r>
-              <w:t xml:space="preserve">Vizenin %60’ı</w:t>
-            </w:r>
-          </w:p>
-        </w:tc>
-        <w:tc>
-          <w:tcPr/>
-          <w:p>
-            <w:pPr>
-              <w:pStyle w:val="Compact"/>
-            </w:pPr>
-            <w:r>
-              <w:t xml:space="preserve">7. hafta (30.10.2026)</w:t>
+              <w:t xml:space="preserve">60% of midterm</w:t>
+            </w:r>
+          </w:p>
+        </w:tc>
+        <w:tc>
+          <w:tcPr/>
+          <w:p>
+            <w:pPr>
+              <w:pStyle w:val="Compact"/>
+            </w:pPr>
+            <w:r>
+              <w:t xml:space="preserve">Week 7 (30.10.2026)</w:t>
             </w:r>
           </w:p>
         </w:tc>
@@ -3396,7 +3391,7 @@
               <w:pStyle w:val="Compact"/>
             </w:pPr>
             <w:r>
-              <w:t xml:space="preserve">Quiz-1 (1–6. haftalar)</w:t>
+              <w:t xml:space="preserve">Quiz-1 (weeks 1–6)</w:t>
             </w:r>
           </w:p>
         </w:tc>
@@ -3418,18 +3413,18 @@
               <w:pStyle w:val="Compact"/>
             </w:pPr>
             <w:r>
-              <w:t xml:space="preserve">Vizenin %40’ı</w:t>
-            </w:r>
-          </w:p>
-        </w:tc>
-        <w:tc>
-          <w:tcPr/>
-          <w:p>
-            <w:pPr>
-              <w:pStyle w:val="Compact"/>
-            </w:pPr>
-            <w:r>
-              <w:t xml:space="preserve">8. hafta, ara sınav haftası (31.10–08.11.2026)</w:t>
+              <w:t xml:space="preserve">40% of midterm</w:t>
+            </w:r>
+          </w:p>
+        </w:tc>
+        <w:tc>
+          <w:tcPr/>
+          <w:p>
+            <w:pPr>
+              <w:pStyle w:val="Compact"/>
+            </w:pPr>
+            <w:r>
+              <w:t xml:space="preserve">Week 8, midterm exam week (31.10–08.11.2026)</w:t>
             </w:r>
           </w:p>
         </w:tc>
@@ -3442,7 +3437,7 @@
               <w:pStyle w:val="Compact"/>
             </w:pPr>
             <w:r>
-              <w:t xml:space="preserve">Proje kontrolü 2 — final rapor ve gösterim (rubrik)</w:t>
+              <w:t xml:space="preserve">Project checkpoint 2 — final report and demonstration (rubric)</w:t>
             </w:r>
           </w:p>
         </w:tc>
@@ -3464,18 +3459,18 @@
               <w:pStyle w:val="Compact"/>
             </w:pPr>
             <w:r>
-              <w:t xml:space="preserve">Finalin %70’i</w:t>
-            </w:r>
-          </w:p>
-        </w:tc>
-        <w:tc>
-          <w:tcPr/>
-          <w:p>
-            <w:pPr>
-              <w:pStyle w:val="Compact"/>
-            </w:pPr>
-            <w:r>
-              <w:t xml:space="preserve">15. hafta (25.12.2026)</w:t>
+              <w:t xml:space="preserve">70% of final</w:t>
+            </w:r>
+          </w:p>
+        </w:tc>
+        <w:tc>
+          <w:tcPr/>
+          <w:p>
+            <w:pPr>
+              <w:pStyle w:val="Compact"/>
+            </w:pPr>
+            <w:r>
+              <w:t xml:space="preserve">Week 15 (25.12.2026)</w:t>
             </w:r>
           </w:p>
         </w:tc>
@@ -3488,7 +3483,7 @@
               <w:pStyle w:val="Compact"/>
             </w:pPr>
             <w:r>
-              <w:t xml:space="preserve">Quiz-2 (9–14. haftalar)</w:t>
+              <w:t xml:space="preserve">Quiz-2 (weeks 9–14)</w:t>
             </w:r>
           </w:p>
         </w:tc>
@@ -3510,18 +3505,18 @@
               <w:pStyle w:val="Compact"/>
             </w:pPr>
             <w:r>
-              <w:t xml:space="preserve">Finalin %30’u</w:t>
-            </w:r>
-          </w:p>
-        </w:tc>
-        <w:tc>
-          <w:tcPr/>
-          <w:p>
-            <w:pPr>
-              <w:pStyle w:val="Compact"/>
-            </w:pPr>
-            <w:r>
-              <w:t xml:space="preserve">16. hafta, final dönemi (04–17.01.2027)</w:t>
+              <w:t xml:space="preserve">30% of final</w:t>
+            </w:r>
+          </w:p>
+        </w:tc>
+        <w:tc>
+          <w:tcPr/>
+          <w:p>
+            <w:pPr>
+              <w:pStyle w:val="Compact"/>
+            </w:pPr>
+            <w:r>
+              <w:t xml:space="preserve">Week 16, final exam period (04–17.01.2027)</w:t>
             </w:r>
           </w:p>
         </w:tc>
@@ -3532,7 +3527,7 @@
         <w:pStyle w:val="BodyText"/>
       </w:pPr>
       <w:r>
-        <w:t xml:space="preserve">Rubrik kriterleri (ritim):</w:t>
+        <w:t xml:space="preserve">Rubric criteria (ritim):</w:t>
       </w:r>
       <w:r>
         <w:t xml:space="preserve"> </w:t>
@@ -3542,19 +3537,19 @@
           <w:b/>
           <w:bCs/>
         </w:rPr>
-        <w:t xml:space="preserve">vize kontrolü</w:t>
-      </w:r>
-      <w:r>
-        <w:t xml:space="preserve"> </w:t>
-      </w:r>
-      <w:r>
-        <w:t xml:space="preserve">— güvenlik analizi (ÖÇ.1), veri güvenliği (ÖÇ.2), C/C++ kod</w:t>
-      </w:r>
-      <w:r>
-        <w:t xml:space="preserve"> </w:t>
-      </w:r>
-      <w:r>
-        <w:t xml:space="preserve">sağlamlaştırma ve RASP teknikleri (ÖÇ.3), proje yönetimi (ÖÇ.5), ara rapor (ÖÇ.7);</w:t>
+        <w:t xml:space="preserve">midterm checkpoint</w:t>
+      </w:r>
+      <w:r>
+        <w:t xml:space="preserve"> </w:t>
+      </w:r>
+      <w:r>
+        <w:t xml:space="preserve">— security analysis (LO.1), data security (LO.2), C/C++ code</w:t>
+      </w:r>
+      <w:r>
+        <w:t xml:space="preserve"> </w:t>
+      </w:r>
+      <w:r>
+        <w:t xml:space="preserve">hardening and RASP techniques (LO.3), project management (LO.5), midterm report (LO.7);</w:t>
       </w:r>
       <w:r>
         <w:t xml:space="preserve"> </w:t>
@@ -3564,25 +3559,25 @@
           <w:b/>
           <w:bCs/>
         </w:rPr>
-        <w:t xml:space="preserve">final kontrolü</w:t>
-      </w:r>
-      <w:r>
-        <w:t xml:space="preserve"> </w:t>
-      </w:r>
-      <w:r>
-        <w:t xml:space="preserve">— kriptografi</w:t>
-      </w:r>
-      <w:r>
-        <w:t xml:space="preserve"> </w:t>
-      </w:r>
-      <w:r>
-        <w:t xml:space="preserve">uygulaması (ÖÇ.2), güvenli iletişim (ÖÇ.4), varlık yönetimi (ÖÇ.5), ikili uygulama korumaları (ÖÇ.3), güvenlik testi</w:t>
-      </w:r>
-      <w:r>
-        <w:t xml:space="preserve"> </w:t>
-      </w:r>
-      <w:r>
-        <w:t xml:space="preserve">ve birim testleri (ÖÇ.6), güvenlik standartları, final rapor ve sunum (ÖÇ.7).</w:t>
+        <w:t xml:space="preserve">final checkpoint</w:t>
+      </w:r>
+      <w:r>
+        <w:t xml:space="preserve"> </w:t>
+      </w:r>
+      <w:r>
+        <w:t xml:space="preserve">—</w:t>
+      </w:r>
+      <w:r>
+        <w:t xml:space="preserve"> </w:t>
+      </w:r>
+      <w:r>
+        <w:t xml:space="preserve">cryptography implementation (LO.2), secure communication (LO.4), asset management (LO.5), binary application</w:t>
+      </w:r>
+      <w:r>
+        <w:t xml:space="preserve"> </w:t>
+      </w:r>
+      <w:r>
+        <w:t xml:space="preserve">protections (LO.3), security testing and unit tests (LO.6), security standards, final report and presentation (LO.7).</w:t>
       </w:r>
     </w:p>
     <w:p>
@@ -3595,30 +3590,45 @@
         </m:oMathParaPr>
         <m:oMath>
           <m:r>
-            <m:t>N</m:t>
-          </m:r>
-          <m:r>
-            <m:t>o</m:t>
+            <m:t>G</m:t>
+          </m:r>
+          <m:r>
+            <m:t>r</m:t>
+          </m:r>
+          <m:r>
+            <m:t>a</m:t>
+          </m:r>
+          <m:r>
+            <m:t>d</m:t>
           </m:r>
           <m:sSub>
             <m:e>
               <m:r>
-                <m:t>t</m:t>
+                <m:t>e</m:t>
               </m:r>
             </m:e>
             <m:sub>
               <m:r>
-                <m:t>V</m:t>
+                <m:t>M</m:t>
               </m:r>
               <m:r>
                 <m:t>i</m:t>
               </m:r>
               <m:r>
-                <m:t>z</m:t>
+                <m:t>d</m:t>
+              </m:r>
+              <m:r>
+                <m:t>t</m:t>
               </m:r>
               <m:r>
                 <m:t>e</m:t>
               </m:r>
+              <m:r>
+                <m:t>r</m:t>
+              </m:r>
+              <m:r>
+                <m:t>m</m:t>
+              </m:r>
             </m:sub>
           </m:sSub>
           <m:r>
@@ -3676,15 +3686,21 @@
             <m:t>  </m:t>
           </m:r>
           <m:r>
-            <m:t>N</m:t>
-          </m:r>
-          <m:r>
-            <m:t>o</m:t>
+            <m:t>G</m:t>
+          </m:r>
+          <m:r>
+            <m:t>r</m:t>
+          </m:r>
+          <m:r>
+            <m:t>a</m:t>
+          </m:r>
+          <m:r>
+            <m:t>d</m:t>
           </m:r>
           <m:sSub>
             <m:e>
               <m:r>
-                <m:t>t</m:t>
+                <m:t>e</m:t>
               </m:r>
             </m:e>
             <m:sub>
@@ -3769,37 +3785,43 @@
         </m:oMathParaPr>
         <m:oMath>
           <m:r>
-            <m:t>B</m:t>
+            <m:t>P</m:t>
           </m:r>
           <m:r>
             <m:t>a</m:t>
           </m:r>
           <m:r>
-            <m:t>ş</m:t>
+            <m:t>s</m:t>
+          </m:r>
+          <m:r>
+            <m:t>s</m:t>
+          </m:r>
+          <m:r>
+            <m:t>i</m:t>
+          </m:r>
+          <m:r>
+            <m:t>n</m:t>
+          </m:r>
+          <m:r>
+            <m:t>g</m:t>
+          </m:r>
+          <m:r>
+            <m:t> </m:t>
+          </m:r>
+          <m:r>
+            <m:t>G</m:t>
+          </m:r>
+          <m:r>
+            <m:t>r</m:t>
           </m:r>
           <m:r>
             <m:t>a</m:t>
           </m:r>
           <m:r>
-            <m:t>r</m:t>
-          </m:r>
-          <m:r>
-            <m:t>ı</m:t>
-          </m:r>
-          <m:r>
-            <m:t> </m:t>
-          </m:r>
-          <m:r>
-            <m:t>N</m:t>
-          </m:r>
-          <m:r>
-            <m:t>o</m:t>
-          </m:r>
-          <m:r>
-            <m:t>t</m:t>
-          </m:r>
-          <m:r>
-            <m:t>u</m:t>
+            <m:t>d</m:t>
+          </m:r>
+          <m:r>
+            <m:t>e</m:t>
           </m:r>
           <m:r>
             <m:rPr>
@@ -3814,30 +3836,45 @@
             <m:t> </m:t>
           </m:r>
           <m:r>
-            <m:t>N</m:t>
-          </m:r>
-          <m:r>
-            <m:t>o</m:t>
+            <m:t>G</m:t>
+          </m:r>
+          <m:r>
+            <m:t>r</m:t>
+          </m:r>
+          <m:r>
+            <m:t>a</m:t>
+          </m:r>
+          <m:r>
+            <m:t>d</m:t>
           </m:r>
           <m:sSub>
             <m:e>
               <m:r>
-                <m:t>t</m:t>
+                <m:t>e</m:t>
               </m:r>
             </m:e>
             <m:sub>
               <m:r>
-                <m:t>V</m:t>
+                <m:t>M</m:t>
               </m:r>
               <m:r>
                 <m:t>i</m:t>
               </m:r>
               <m:r>
-                <m:t>z</m:t>
+                <m:t>d</m:t>
+              </m:r>
+              <m:r>
+                <m:t>t</m:t>
               </m:r>
               <m:r>
                 <m:t>e</m:t>
               </m:r>
+              <m:r>
+                <m:t>r</m:t>
+              </m:r>
+              <m:r>
+                <m:t>m</m:t>
+              </m:r>
             </m:sub>
           </m:sSub>
           <m:r>
@@ -3853,15 +3890,21 @@
             <m:t> </m:t>
           </m:r>
           <m:r>
-            <m:t>N</m:t>
-          </m:r>
-          <m:r>
-            <m:t>o</m:t>
+            <m:t>G</m:t>
+          </m:r>
+          <m:r>
+            <m:t>r</m:t>
+          </m:r>
+          <m:r>
+            <m:t>a</m:t>
+          </m:r>
+          <m:r>
+            <m:t>d</m:t>
           </m:r>
           <m:sSub>
             <m:e>
               <m:r>
-                <m:t>t</m:t>
+                <m:t>e</m:t>
               </m:r>
             </m:e>
             <m:sub>
@@ -3885,13 +3928,13 @@
         </m:oMath>
       </m:oMathPara>
     </w:p>
-    <w:bookmarkStart w:id="29" w:name="iş-yükü-akts-5-125-saat"/>
+    <w:bookmarkStart w:id="29" w:name="workload-ects-5-125-hours"/>
     <w:p>
       <w:pPr>
         <w:pStyle w:val="Heading3"/>
       </w:pPr>
       <w:r>
-        <w:t xml:space="preserve">İş yükü (AKTS 5 = 125 saat)</w:t>
+        <w:t xml:space="preserve">Workload (ECTS 5 = 125 hours)</w:t>
       </w:r>
     </w:p>
     <w:tbl>
@@ -3917,40 +3960,40 @@
               <w:pStyle w:val="Compact"/>
             </w:pPr>
             <w:r>
-              <w:t xml:space="preserve">Etkinlik</w:t>
-            </w:r>
-          </w:p>
-        </w:tc>
-        <w:tc>
-          <w:tcPr/>
-          <w:p>
-            <w:pPr>
-              <w:pStyle w:val="Compact"/>
-            </w:pPr>
-            <w:r>
-              <w:t xml:space="preserve">Sayı</w:t>
-            </w:r>
-          </w:p>
-        </w:tc>
-        <w:tc>
-          <w:tcPr/>
-          <w:p>
-            <w:pPr>
-              <w:pStyle w:val="Compact"/>
-            </w:pPr>
-            <w:r>
-              <w:t xml:space="preserve">Süre</w:t>
-            </w:r>
-          </w:p>
-        </w:tc>
-        <w:tc>
-          <w:tcPr/>
-          <w:p>
-            <w:pPr>
-              <w:pStyle w:val="Compact"/>
-            </w:pPr>
-            <w:r>
-              <w:t xml:space="preserve">Toplam</w:t>
+              <w:t xml:space="preserve">Activity</w:t>
+            </w:r>
+          </w:p>
+        </w:tc>
+        <w:tc>
+          <w:tcPr/>
+          <w:p>
+            <w:pPr>
+              <w:pStyle w:val="Compact"/>
+            </w:pPr>
+            <w:r>
+              <w:t xml:space="preserve">Count</w:t>
+            </w:r>
+          </w:p>
+        </w:tc>
+        <w:tc>
+          <w:tcPr/>
+          <w:p>
+            <w:pPr>
+              <w:pStyle w:val="Compact"/>
+            </w:pPr>
+            <w:r>
+              <w:t xml:space="preserve">Hours</w:t>
+            </w:r>
+          </w:p>
+        </w:tc>
+        <w:tc>
+          <w:tcPr/>
+          <w:p>
+            <w:pPr>
+              <w:pStyle w:val="Compact"/>
+            </w:pPr>
+            <w:r>
+              <w:t xml:space="preserve">Total</w:t>
             </w:r>
           </w:p>
         </w:tc>
@@ -3963,7 +4006,7 @@
               <w:pStyle w:val="Compact"/>
             </w:pPr>
             <w:r>
-              <w:t xml:space="preserve">Derse Katılım</w:t>
+              <w:t xml:space="preserve">Class attendance</w:t>
             </w:r>
           </w:p>
         </w:tc>
@@ -4009,7 +4052,7 @@
               <w:pStyle w:val="Compact"/>
             </w:pPr>
             <w:r>
-              <w:t xml:space="preserve">Bireysel Çalışma (haftalık notlar ve uygulamalar)</w:t>
+              <w:t xml:space="preserve">Individual study (weekly notes and exercises)</w:t>
             </w:r>
           </w:p>
         </w:tc>
@@ -4055,7 +4098,7 @@
               <w:pStyle w:val="Compact"/>
             </w:pPr>
             <w:r>
-              <w:t xml:space="preserve">Quiz (ara sınav haftası ve final dönemi)</w:t>
+              <w:t xml:space="preserve">Quiz (midterm exam week and final exam period)</w:t>
             </w:r>
           </w:p>
         </w:tc>
@@ -4101,7 +4144,7 @@
               <w:pStyle w:val="Compact"/>
             </w:pPr>
             <w:r>
-              <w:t xml:space="preserve">Quiz için Bireysel Çalışma</w:t>
+              <w:t xml:space="preserve">Individual study for quizzes</w:t>
             </w:r>
           </w:p>
         </w:tc>
@@ -4147,7 +4190,7 @@
               <w:pStyle w:val="Compact"/>
             </w:pPr>
             <w:r>
-              <w:t xml:space="preserve">Proje Hazırlama (vize ve final kontrolleri)</w:t>
+              <w:t xml:space="preserve">Project preparation (midterm and final checkpoints)</w:t>
             </w:r>
           </w:p>
         </w:tc>
@@ -4193,7 +4236,7 @@
               <w:pStyle w:val="Compact"/>
             </w:pPr>
             <w:r>
-              <w:t xml:space="preserve">Rapor Hazırlama</w:t>
+              <w:t xml:space="preserve">Report preparation</w:t>
             </w:r>
           </w:p>
         </w:tc>
@@ -4239,7 +4282,7 @@
               <w:pStyle w:val="Compact"/>
             </w:pPr>
             <w:r>
-              <w:t xml:space="preserve">Proje Sunma (gösterim ve sorular)</w:t>
+              <w:t xml:space="preserve">Project presentation (demonstration and questions)</w:t>
             </w:r>
           </w:p>
         </w:tc>
@@ -4261,7 +4304,7 @@
               <w:pStyle w:val="Compact"/>
             </w:pPr>
             <w:r>
-              <w:t xml:space="preserve">1,5</w:t>
+              <w:t xml:space="preserve">1.5</w:t>
             </w:r>
           </w:p>
         </w:tc>
@@ -4289,7 +4332,7 @@
                 <w:b/>
                 <w:bCs/>
               </w:rPr>
-              <w:t xml:space="preserve">Toplam</w:t>
+              <w:t xml:space="preserve">Total</w:t>
             </w:r>
           </w:p>
         </w:tc>
@@ -4335,13 +4378,13 @@
     </w:p>
     <w:bookmarkEnd w:id="29"/>
     <w:bookmarkEnd w:id="30"/>
-    <w:bookmarkStart w:id="31" w:name="f.-öğretim-yöntemleri"/>
+    <w:bookmarkStart w:id="31" w:name="f.-instructional-strategies-and-methods"/>
     <w:p>
       <w:pPr>
         <w:pStyle w:val="Heading2"/>
       </w:pPr>
       <w:r>
-        <w:t xml:space="preserve">F. Öğretim Yöntemleri</w:t>
+        <w:t xml:space="preserve">F. Instructional Strategies and Methods</w:t>
       </w:r>
     </w:p>
     <w:p>
@@ -4349,31 +4392,31 @@
         <w:pStyle w:val="FirstParagraph"/>
       </w:pPr>
       <w:r>
-        <w:t xml:space="preserve">Dersler sınıfta yüz yüze yapılır; anlatım, soru–cevap ve uygulamalı programlama bir arada kullanılır. Her içerik</w:t>
-      </w:r>
-      <w:r>
-        <w:t xml:space="preserve"> </w:t>
-      </w:r>
-      <w:r>
-        <w:t xml:space="preserve">haftası ders notu, sunum, çözümlü örnekler ve kendini sınama sorularıyla birlikte gelir; uygulamalar hatalı kod →</w:t>
-      </w:r>
-      <w:r>
-        <w:t xml:space="preserve"> </w:t>
-      </w:r>
-      <w:r>
-        <w:t xml:space="preserve">saldırı → düzeltme sırasıyla, derste verilen yalıtılmış ortamlarda (konteyner ya da sanal makine) yapılır. Derste</w:t>
-      </w:r>
-      <w:r>
-        <w:t xml:space="preserve"> </w:t>
-      </w:r>
-      <w:r>
-        <w:t xml:space="preserve">öğrenilen saldırı teknikleri yalnızca bu ortamlarda ve öğrencinin kendi sistemlerinde denenir. Duyurular, kaynaklar ve</w:t>
-      </w:r>
-      <w:r>
-        <w:t xml:space="preserve"> </w:t>
-      </w:r>
-      <w:r>
-        <w:t xml:space="preserve">teslimler ders sınıfında yürütülür. Yoklama alınır.</w:t>
+        <w:t xml:space="preserve">Lectures are face-to-face in the classroom and combine explanation, question–answer and hands-on programming.</w:t>
+      </w:r>
+      <w:r>
+        <w:t xml:space="preserve"> </w:t>
+      </w:r>
+      <w:r>
+        <w:t xml:space="preserve">Each content week comes with course notes, slides, worked examples and self-check questions; exercises follow the</w:t>
+      </w:r>
+      <w:r>
+        <w:t xml:space="preserve"> </w:t>
+      </w:r>
+      <w:r>
+        <w:t xml:space="preserve">order vulnerable code → attack → fix and run in the isolated environments provided in class (containers or virtual</w:t>
+      </w:r>
+      <w:r>
+        <w:t xml:space="preserve"> </w:t>
+      </w:r>
+      <w:r>
+        <w:t xml:space="preserve">machines). Attack techniques learned in class are tried only in these environments and on the student’s own systems.</w:t>
+      </w:r>
+      <w:r>
+        <w:t xml:space="preserve"> </w:t>
+      </w:r>
+      <w:r>
+        <w:t xml:space="preserve">Announcements, resources and submissions are handled in the course class. Attendance is taken.</w:t>
       </w:r>
     </w:p>
     <w:p>
@@ -4384,13 +4427,13 @@
       </w:r>
     </w:p>
     <w:bookmarkEnd w:id="31"/>
-    <w:bookmarkStart w:id="32" w:name="g.-geç-teslim"/>
+    <w:bookmarkStart w:id="32" w:name="g.-late-homework"/>
     <w:p>
       <w:pPr>
         <w:pStyle w:val="Heading2"/>
       </w:pPr>
       <w:r>
-        <w:t xml:space="preserve">G. Geç Teslim</w:t>
+        <w:t xml:space="preserve">G. Late Homework</w:t>
       </w:r>
     </w:p>
     <w:p>
@@ -4398,13 +4441,13 @@
         <w:pStyle w:val="FirstParagraph"/>
       </w:pPr>
       <w:r>
-        <w:t xml:space="preserve">Ödev ve projelerin belirlenen tarihlerde teslim edilmesi gerekir. Geç teslimler kabul edilmez. Beklenmedik durumlar en</w:t>
-      </w:r>
-      <w:r>
-        <w:t xml:space="preserve"> </w:t>
-      </w:r>
-      <w:r>
-        <w:t xml:space="preserve">kısa sürede öğretim üyesine bildirilmelidir.</w:t>
+        <w:t xml:space="preserve">Assignments and projects must be submitted by the announced deadlines. Late submissions will not be accepted.</w:t>
+      </w:r>
+      <w:r>
+        <w:t xml:space="preserve"> </w:t>
+      </w:r>
+      <w:r>
+        <w:t xml:space="preserve">Unexpected situations must be reported to the instructor as soon as possible.</w:t>
       </w:r>
     </w:p>
     <w:p>
@@ -4415,13 +4458,13 @@
       </w:r>
     </w:p>
     <w:bookmarkEnd w:id="32"/>
-    <w:bookmarkStart w:id="33" w:name="h.-ders-platformu-ve-iletişim"/>
+    <w:bookmarkStart w:id="33" w:name="h.-course-platform-and-communication"/>
     <w:p>
       <w:pPr>
         <w:pStyle w:val="Heading2"/>
       </w:pPr>
       <w:r>
-        <w:t xml:space="preserve">H. Ders Platformu ve İletişim</w:t>
+        <w:t xml:space="preserve">H. Course Platform and Communication</w:t>
       </w:r>
     </w:p>
     <w:p>
@@ -4429,19 +4472,19 @@
         <w:pStyle w:val="FirstParagraph"/>
       </w:pPr>
       <w:r>
-        <w:t xml:space="preserve">Bütün duyurular, kaynaklar ve teslimler her dönem yeniden açılan ders sınıfında paylaşılır; sınıf kodu 1. haftada</w:t>
-      </w:r>
-      <w:r>
-        <w:t xml:space="preserve"> </w:t>
-      </w:r>
-      <w:r>
-        <w:t xml:space="preserve">duyurulur. Ders notları, sunumlar ve indirilebilir belgeler ders web sitesindedir. Sınıfı ve üniversite e-postanızı her</w:t>
-      </w:r>
-      <w:r>
-        <w:t xml:space="preserve"> </w:t>
-      </w:r>
-      <w:r>
-        <w:t xml:space="preserve">gün kontrol edin.</w:t>
+        <w:t xml:space="preserve">All announcements, resources and submissions are shared in the course class, which is opened anew every term; the</w:t>
+      </w:r>
+      <w:r>
+        <w:t xml:space="preserve"> </w:t>
+      </w:r>
+      <w:r>
+        <w:t xml:space="preserve">class code is announced in week 1. Course notes, slides and downloadable documents are on the course website. Check</w:t>
+      </w:r>
+      <w:r>
+        <w:t xml:space="preserve"> </w:t>
+      </w:r>
+      <w:r>
+        <w:t xml:space="preserve">the class and your university e-mail every day.</w:t>
       </w:r>
     </w:p>
     <w:p>
@@ -4452,13 +4495,13 @@
       </w:r>
     </w:p>
     <w:bookmarkEnd w:id="33"/>
-    <w:bookmarkStart w:id="36" w:name="i.-akademik-dürüstlük-intihal-ve-kopya"/>
+    <w:bookmarkStart w:id="36" w:name="X727147e054bfc715bb874db619c5c8cfeda5a5f"/>
     <w:p>
       <w:pPr>
         <w:pStyle w:val="Heading2"/>
       </w:pPr>
       <w:r>
-        <w:t xml:space="preserve">I. Akademik Dürüstlük, İntihal ve Kopya</w:t>
+        <w:t xml:space="preserve">I. Academic Integrity, Plagiarism &amp; Cheating</w:t>
       </w:r>
     </w:p>
     <w:p>
@@ -4466,13 +4509,13 @@
         <w:pStyle w:val="FirstParagraph"/>
       </w:pPr>
       <w:r>
-        <w:t xml:space="preserve">Akademik dürüstlük RTEÜ’nün en önemli ilkelerinden biridir. Akademik dürüstlük ilkelerine aykırı davrananlar ciddi</w:t>
-      </w:r>
-      <w:r>
-        <w:t xml:space="preserve"> </w:t>
-      </w:r>
-      <w:r>
-        <w:t xml:space="preserve">şekilde cezalandırılır.</w:t>
+        <w:t xml:space="preserve">Academic integrity is one of the most important principles of RTEÜ. Anyone who breaches the principles of</w:t>
+      </w:r>
+      <w:r>
+        <w:t xml:space="preserve"> </w:t>
+      </w:r>
+      <w:r>
+        <w:t xml:space="preserve">academic honesty is severely punished.</w:t>
       </w:r>
     </w:p>
     <w:p>
@@ -4480,67 +4523,67 @@
         <w:pStyle w:val="BodyText"/>
       </w:pPr>
       <w:r>
-        <w:t xml:space="preserve">Sınıf arkadaşlarınızla ya da başkalarıyla</w:t>
-      </w:r>
-      <w:r>
-        <w:t xml:space="preserve"> </w:t>
-      </w:r>
-      <w:r>
-        <w:t xml:space="preserve">“birlikte çalışmak”</w:t>
-      </w:r>
-      <w:r>
-        <w:t xml:space="preserve"> </w:t>
-      </w:r>
-      <w:r>
-        <w:t xml:space="preserve">doğaldır. Bir öğrenci zor bir konuyu ya da bütün dersi</w:t>
-      </w:r>
-      <w:r>
-        <w:t xml:space="preserve"> </w:t>
-      </w:r>
-      <w:r>
-        <w:t xml:space="preserve">daha iyi anlamak için ücretli ya da ücretsiz birinden yardım istemiş olabilir. Peki</w:t>
-      </w:r>
-      <w:r>
-        <w:t xml:space="preserve"> </w:t>
-      </w:r>
-      <w:r>
-        <w:t xml:space="preserve">“birlikte çalışmak”</w:t>
-      </w:r>
-      <w:r>
-        <w:t xml:space="preserve"> </w:t>
-      </w:r>
-      <w:r>
-        <w:t xml:space="preserve">ya da</w:t>
-      </w:r>
-      <w:r>
-        <w:t xml:space="preserve"> </w:t>
-      </w:r>
-      <w:r>
-        <w:t xml:space="preserve">“özel</w:t>
-      </w:r>
-      <w:r>
-        <w:t xml:space="preserve"> </w:t>
-      </w:r>
-      <w:r>
-        <w:t xml:space="preserve">ders almak”</w:t>
-      </w:r>
-      <w:r>
-        <w:t xml:space="preserve"> </w:t>
-      </w:r>
-      <w:r>
-        <w:t xml:space="preserve">ile</w:t>
-      </w:r>
-      <w:r>
-        <w:t xml:space="preserve"> </w:t>
-      </w:r>
-      <w:r>
-        <w:t xml:space="preserve">“akademik dürüstlük ihlali”</w:t>
-      </w:r>
-      <w:r>
-        <w:t xml:space="preserve"> </w:t>
-      </w:r>
-      <w:r>
-        <w:t xml:space="preserve">arasındaki sınır nedir? Ne zaman intihal, ne zaman kopya sayılır?</w:t>
+        <w:t xml:space="preserve">It is natural to interact with classmates and others to</w:t>
+      </w:r>
+      <w:r>
+        <w:t xml:space="preserve"> </w:t>
+      </w:r>
+      <w:r>
+        <w:t xml:space="preserve">“study together”</w:t>
+      </w:r>
+      <w:r>
+        <w:t xml:space="preserve">. It may also be the case where a student</w:t>
+      </w:r>
+      <w:r>
+        <w:t xml:space="preserve"> </w:t>
+      </w:r>
+      <w:r>
+        <w:t xml:space="preserve">asks for help from someone else, paid or unpaid, to better understand a difficult topic or a whole course. However,</w:t>
+      </w:r>
+      <w:r>
+        <w:t xml:space="preserve"> </w:t>
+      </w:r>
+      <w:r>
+        <w:t xml:space="preserve">what is the borderline between</w:t>
+      </w:r>
+      <w:r>
+        <w:t xml:space="preserve"> </w:t>
+      </w:r>
+      <w:r>
+        <w:t xml:space="preserve">“studying together”</w:t>
+      </w:r>
+      <w:r>
+        <w:t xml:space="preserve"> </w:t>
+      </w:r>
+      <w:r>
+        <w:t xml:space="preserve">or</w:t>
+      </w:r>
+      <w:r>
+        <w:t xml:space="preserve"> </w:t>
+      </w:r>
+      <w:r>
+        <w:t xml:space="preserve">“taking private lessons”</w:t>
+      </w:r>
+      <w:r>
+        <w:t xml:space="preserve"> </w:t>
+      </w:r>
+      <w:r>
+        <w:t xml:space="preserve">and</w:t>
+      </w:r>
+      <w:r>
+        <w:t xml:space="preserve"> </w:t>
+      </w:r>
+      <w:r>
+        <w:t xml:space="preserve">“academic dishonesty”</w:t>
+      </w:r>
+      <w:r>
+        <w:t xml:space="preserve">? When is</w:t>
+      </w:r>
+      <w:r>
+        <w:t xml:space="preserve"> </w:t>
+      </w:r>
+      <w:r>
+        <w:t xml:space="preserve">it plagiarism, when is it cheating?</w:t>
       </w:r>
     </w:p>
     <w:p>
@@ -4548,52 +4591,49 @@
         <w:pStyle w:val="BodyText"/>
       </w:pPr>
       <w:r>
-        <w:t xml:space="preserve">Başka bir öğrencinin kâğıdına ya da sınavda izin verilmeyen bir kaynağa bakmak kopyadır ve cezalandırılır. Ancak pek</w:t>
-      </w:r>
-      <w:r>
-        <w:t xml:space="preserve"> </w:t>
-      </w:r>
-      <w:r>
-        <w:t xml:space="preserve">çok öğrenci üniversiteye geldiğinde, özellikle ödevlerde neyin kabul edilebilir olduğu ve neyin</w:t>
-      </w:r>
-      <w:r>
-        <w:t xml:space="preserve"> </w:t>
-      </w:r>
-      <w:r>
-        <w:t xml:space="preserve">“kopya”</w:t>
-      </w:r>
-      <w:r>
-        <w:t xml:space="preserve"> </w:t>
-      </w:r>
-      <w:r>
-        <w:t xml:space="preserve">sayıldığı</w:t>
-      </w:r>
-      <w:r>
-        <w:t xml:space="preserve"> </w:t>
-      </w:r>
-      <w:r>
-        <w:t xml:space="preserve">konusunda çok az deneyime sahiptir. Aşağıdaki açıklamalar notlandırılan ödevlerde akademik dürüstlük anlayışını</w:t>
-      </w:r>
-      <w:r>
-        <w:t xml:space="preserve"> </w:t>
-      </w:r>
-      <w:r>
-        <w:t xml:space="preserve">özetler. Aşağıda tanımlanmayan bir durumla karşılaşırsanız, yapmak istediğinizin akademik dürüstlük çerçevesinde kalıp</w:t>
-      </w:r>
-      <w:r>
-        <w:t xml:space="preserve"> </w:t>
-      </w:r>
-      <w:r>
-        <w:t xml:space="preserve">kalmadığını öğretim üyesine danışın.</w:t>
-      </w:r>
-    </w:p>
-    <w:bookmarkStart w:id="34" w:name="Xac8cd01a388d09f399c1f787d952a3287551baa"/>
+        <w:t xml:space="preserve">Looking at another student’s paper or any source other than what is allowed during the exam is cheating and will be</w:t>
+      </w:r>
+      <w:r>
+        <w:t xml:space="preserve"> </w:t>
+      </w:r>
+      <w:r>
+        <w:t xml:space="preserve">punished. However, many students come to university with very little experience of what is acceptable and what</w:t>
+      </w:r>
+      <w:r>
+        <w:t xml:space="preserve"> </w:t>
+      </w:r>
+      <w:r>
+        <w:t xml:space="preserve">counts as</w:t>
+      </w:r>
+      <w:r>
+        <w:t xml:space="preserve"> </w:t>
+      </w:r>
+      <w:r>
+        <w:t xml:space="preserve">“copying”</w:t>
+      </w:r>
+      <w:r>
+        <w:t xml:space="preserve">, especially for assignments. The following guidelines highlight the philosophy of academic</w:t>
+      </w:r>
+      <w:r>
+        <w:t xml:space="preserve"> </w:t>
+      </w:r>
+      <w:r>
+        <w:t xml:space="preserve">honesty for graded assignments. If a situation arises that is not described below, ask the instructor whether what</w:t>
+      </w:r>
+      <w:r>
+        <w:t xml:space="preserve"> </w:t>
+      </w:r>
+      <w:r>
+        <w:t xml:space="preserve">you intend to do stays within academic honesty.</w:t>
+      </w:r>
+    </w:p>
+    <w:bookmarkStart w:id="34" w:name="X14753e3786b6b4c08f708356f4d3d122c6218bb"/>
     <w:p>
       <w:pPr>
         <w:pStyle w:val="Heading3"/>
       </w:pPr>
       <w:r>
-        <w:t xml:space="preserve">a. Ödev hazırlarken neler kabul edilebilir?</w:t>
+        <w:t xml:space="preserve">a. What is acceptable when preparing an assignment?</w:t>
       </w:r>
     </w:p>
     <w:p>
@@ -4605,7 +4645,7 @@
         </w:numPr>
       </w:pPr>
       <w:r>
-        <w:t xml:space="preserve">Ödevi daha iyi anlamak için sınıf arkadaşlarınızla konuşmak.</w:t>
+        <w:t xml:space="preserve">Communicating with classmates about the assignment to understand it better.</w:t>
       </w:r>
     </w:p>
     <w:p>
@@ -4617,13 +4657,13 @@
         </w:numPr>
       </w:pPr>
       <w:r>
-        <w:t xml:space="preserve">İnternette ya da başka bir yerde bulduğunuz fikirleri, alıntıları, paragrafları ya da küçük kod parçalarını,</w:t>
-      </w:r>
-      <w:r>
-        <w:t xml:space="preserve"> </w:t>
-      </w:r>
-      <w:r>
-        <w:t xml:space="preserve">ödevin tamamının çözümü olmamak ve kaynağını belirtmek koşuluyla ödevinize eklemek.</w:t>
+        <w:t xml:space="preserve">Putting ideas, quotes, paragraphs or small pieces of code (snippets) found online or elsewhere into your</w:t>
+      </w:r>
+      <w:r>
+        <w:t xml:space="preserve"> </w:t>
+      </w:r>
+      <w:r>
+        <w:t xml:space="preserve">assignment, provided that they are not themselves the whole solution and you cite their origin.</w:t>
       </w:r>
     </w:p>
     <w:p>
@@ -4635,7 +4675,7 @@
         </w:numPr>
       </w:pPr>
       <w:r>
-        <w:t xml:space="preserve">Ödevinizin dili konusunda yardım istemek.</w:t>
+        <w:t xml:space="preserve">Asking for help with the language of your assignment.</w:t>
       </w:r>
     </w:p>
     <w:p>
@@ -4647,7 +4687,7 @@
         </w:numPr>
       </w:pPr>
       <w:r>
-        <w:t xml:space="preserve">Sınıfta tartışma ortamı oluşturmak için ödevinizin küçük parçalarını paylaşmak.</w:t>
+        <w:t xml:space="preserve">Sharing small pieces of your assignment in class to start a discussion.</w:t>
       </w:r>
     </w:p>
     <w:p>
@@ -4659,13 +4699,13 @@
         </w:numPr>
       </w:pPr>
       <w:r>
-        <w:t xml:space="preserve">Teknik sorunları çözmek için internetten ya da başka kaynaklardan talimat, başvuru kaynağı ya da çözüm aramak; ama</w:t>
-      </w:r>
-      <w:r>
-        <w:t xml:space="preserve"> </w:t>
-      </w:r>
-      <w:r>
-        <w:t xml:space="preserve">ödevin doğrudan cevabını aramamak.</w:t>
+        <w:t xml:space="preserve">Turning to the web or elsewhere for instructions, references and solutions to technical difficulties, but not</w:t>
+      </w:r>
+      <w:r>
+        <w:t xml:space="preserve"> </w:t>
+      </w:r>
+      <w:r>
+        <w:t xml:space="preserve">for direct answers to the assignment.</w:t>
       </w:r>
     </w:p>
     <w:p>
@@ -4677,7 +4717,7 @@
         </w:numPr>
       </w:pPr>
       <w:r>
-        <w:t xml:space="preserve">Çözümleri başkalarıyla metin ya da kod paylaşmadan, diyagramlar ya da özet açıklamalarla tartışmak.</w:t>
+        <w:t xml:space="preserve">Discussing solutions with others using diagrams or summarised statements, but not actual text or code.</w:t>
       </w:r>
     </w:p>
     <w:p>
@@ -4689,17 +4729,17 @@
         </w:numPr>
       </w:pPr>
       <w:r>
-        <w:t xml:space="preserve">Ödevinizi sizin yerinize yapmaması koşuluyla bir eğitmenden (ücretli ya da ücretsiz) yardım almak.</w:t>
+        <w:t xml:space="preserve">Working with (even paying) a tutor, provided the tutor does not do your assignment for you.</w:t>
       </w:r>
     </w:p>
     <w:bookmarkEnd w:id="34"/>
-    <w:bookmarkStart w:id="35" w:name="b.-neler-kabul-edilemez"/>
+    <w:bookmarkStart w:id="35" w:name="b.-what-is-not-acceptable"/>
     <w:p>
       <w:pPr>
         <w:pStyle w:val="Heading3"/>
       </w:pPr>
       <w:r>
-        <w:t xml:space="preserve">b. Neler kabul edilemez?</w:t>
+        <w:t xml:space="preserve">b. What is not acceptable?</w:t>
       </w:r>
     </w:p>
     <w:p>
@@ -4711,7 +4751,7 @@
         </w:numPr>
       </w:pPr>
       <w:r>
-        <w:t xml:space="preserve">Kendi çözümünüzü teslim etmeden önce bir sınıf arkadaşınızdan çözümünü görmek istemek.</w:t>
+        <w:t xml:space="preserve">Asking a classmate to see their solution before submitting your own.</w:t>
       </w:r>
     </w:p>
     <w:p>
@@ -4723,7 +4763,7 @@
         </w:numPr>
       </w:pPr>
       <w:r>
-        <w:t xml:space="preserve">Dış kaynaklardan alıp ödevinize kattığınız herhangi bir metnin ya da kodun kaynağını belirtmemek.</w:t>
+        <w:t xml:space="preserve">Failing to cite the origin of any text or code that you found outside the course and used in your work.</w:t>
       </w:r>
     </w:p>
     <w:p>
@@ -4735,7 +4775,7 @@
         </w:numPr>
       </w:pPr>
       <w:r>
-        <w:t xml:space="preserve">Çözmekte zorlanan bir sınıf arkadaşınıza kendi çözümünüzü vermek ya da göstermek.</w:t>
+        <w:t xml:space="preserve">Giving or showing your solution to a classmate who is struggling to solve the problem.</w:t>
       </w:r>
     </w:p>
     <w:p>
@@ -4747,13 +4787,13 @@
     </w:p>
     <w:bookmarkEnd w:id="35"/>
     <w:bookmarkEnd w:id="36"/>
-    <w:bookmarkStart w:id="37" w:name="j.-beklentiler"/>
+    <w:bookmarkStart w:id="37" w:name="j.-expectations"/>
     <w:p>
       <w:pPr>
         <w:pStyle w:val="Heading2"/>
       </w:pPr>
       <w:r>
-        <w:t xml:space="preserve">J. Beklentiler</w:t>
+        <w:t xml:space="preserve">J. Expectations</w:t>
       </w:r>
     </w:p>
     <w:p>
@@ -4761,13 +4801,19 @@
         <w:pStyle w:val="FirstParagraph"/>
       </w:pPr>
       <w:r>
-        <w:t xml:space="preserve">Derslere zamanında katılmanız ve haftalık gereksinimleri (okumalar ve proje adımları) tamamlamanız beklenir. Öğretim</w:t>
-      </w:r>
-      <w:r>
-        <w:t xml:space="preserve"> </w:t>
-      </w:r>
-      <w:r>
-        <w:t xml:space="preserve">üyesi ile öğrenciler arasındaki ana iletişim kanalı e-postadır. Sorularınızı üniversite e-posta adresinizden gönderin;</w:t>
+        <w:t xml:space="preserve">You are expected to attend classes on time and complete the weekly requirements (readings and project milestones).</w:t>
+      </w:r>
+      <w:r>
+        <w:t xml:space="preserve"> </w:t>
+      </w:r>
+      <w:r>
+        <w:t xml:space="preserve">The main communication channel between the instructor and students is e-mail. Send your questions from your</w:t>
+      </w:r>
+      <w:r>
+        <w:t xml:space="preserve"> </w:t>
+      </w:r>
+      <w:r>
+        <w:t xml:space="preserve">university e-mail address;</w:t>
       </w:r>
       <w:r>
         <w:t xml:space="preserve"> </w:t>
@@ -4777,16 +4823,16 @@
           <w:b/>
           <w:bCs/>
         </w:rPr>
-        <w:t xml:space="preserve">konu satırına ders kodunu, mesaja adınızı yazın</w:t>
-      </w:r>
-      <w:r>
-        <w:t xml:space="preserve">. Öğretim üyesi de gerektiğinde sizinle e-posta ile iletişime</w:t>
-      </w:r>
-      <w:r>
-        <w:t xml:space="preserve"> </w:t>
-      </w:r>
-      <w:r>
-        <w:t xml:space="preserve">geçer; bu yüzden e-postanızı her gün kontrol edin.</w:t>
+        <w:t xml:space="preserve">include the course code in the subject line and your name in the message</w:t>
+      </w:r>
+      <w:r>
+        <w:t xml:space="preserve">. The</w:t>
+      </w:r>
+      <w:r>
+        <w:t xml:space="preserve"> </w:t>
+      </w:r>
+      <w:r>
+        <w:t xml:space="preserve">instructor will also contact you by e-mail when necessary, so check your e-mail every day.</w:t>
       </w:r>
     </w:p>
     <w:p>
@@ -4797,13 +4843,13 @@
       </w:r>
     </w:p>
     <w:bookmarkEnd w:id="37"/>
-    <w:bookmarkStart w:id="38" w:name="X5e10b1f1f6a72868128d5e3d8a6bd0bcb2a335f"/>
+    <w:bookmarkStart w:id="38" w:name="k.-lecture-content-and-syllabus-updates"/>
     <w:p>
       <w:pPr>
         <w:pStyle w:val="Heading2"/>
       </w:pPr>
       <w:r>
-        <w:t xml:space="preserve">K. Ders İçeriği ve İzlence Güncellemeleri</w:t>
+        <w:t xml:space="preserve">K. Lecture Content and Syllabus Updates</w:t>
       </w:r>
     </w:p>
     <w:p>
@@ -4811,13 +4857,13 @@
         <w:pStyle w:val="FirstParagraph"/>
       </w:pPr>
       <w:r>
-        <w:t xml:space="preserve">Gerektiğinde ders içeriği ya da ders takvimi değiştirilebilir. Bu belge kapsamındaki her değişiklik öğretim üyesi</w:t>
-      </w:r>
-      <w:r>
-        <w:t xml:space="preserve"> </w:t>
-      </w:r>
-      <w:r>
-        <w:t xml:space="preserve">tarafından duyurulur.</w:t>
+        <w:t xml:space="preserve">If deemed necessary, the lecture content or course schedule may change. Any change within the scope of this</w:t>
+      </w:r>
+      <w:r>
+        <w:t xml:space="preserve"> </w:t>
+      </w:r>
+      <w:r>
+        <w:t xml:space="preserve">document will be announced by the instructor.</w:t>
       </w:r>
     </w:p>
     <w:bookmarkEnd w:id="38"/>
@@ -5171,7 +5217,7 @@
         <w:rFonts w:asciiTheme="minorHAnsi" w:cstheme="minorBidi" w:eastAsiaTheme="minorHAnsi" w:hAnsiTheme="minorHAnsi"/>
         <w:sz w:val="24"/>
         <w:szCs w:val="24"/>
-        <w:lang w:bidi="ar-SA" w:eastAsia="en-US" w:val="tr"/>
+        <w:lang w:bidi="ar-SA" w:eastAsia="en-US" w:val="en-US"/>
       </w:rPr>
     </w:rPrDefault>
     <w:pPrDefault>

</xml_diff>

<commit_message>
Türkçe terimler, CI düzeltmesi, bağımlılık güncellemeleri ve yeniden üretilen çıktılar
- Türkçe sürümde terimler "Türkçe (English)" kuralına göre düzeltildi (biçim dizesi, dize,
  kod sökme, OCSP yanıtını iliştirme, sağlamlaştırma (hardening) vb.); değişen başlık
  bağlantıları güncellendi.
- CI: güncel actions sürümleri, Python 3.12, sabit requirements; gh-pages commit'leri ders
  sorumlusunun adıyla.
- Güvenlik açığı bildirimleri: mkdocs-material 9.7.7, pymdown-extensions 11.0.1, Jinja2 3.1.6;
  tags eklentisi yeni yapılandırmaya taşındı.
- PPTX üreticisi: görseller kalan alana sığdırılıyor, slayt dışına taşma yok.
- Hafta 6: saldırgan-savunmacı diyalog slaytları geri eklendi.
- Bütün sunum, PDF, PPTX ve DOCX çıktıları yeniden üretildi.
- git-scripts: gitprep yardımcı betikleri.
</commit_message>
<xml_diff>
--- a/docs/syllabus/cen429-izlence-ders-notu.en.docx
+++ b/docs/syllabus/cen429-izlence-ders-notu.en.docx
@@ -2,7 +2,7 @@
 <file path=word/document.xml><?xml version="1.0" encoding="utf-8"?>
 <w:document xmlns:w="http://schemas.openxmlformats.org/wordprocessingml/2006/main" xmlns:m="http://schemas.openxmlformats.org/officeDocument/2006/math" xmlns:r="http://schemas.openxmlformats.org/officeDocument/2006/relationships" xmlns:o="urn:schemas-microsoft-com:office:office" xmlns:v="urn:schemas-microsoft-com:vml" xmlns:w10="urn:schemas-microsoft-com:office:word" xmlns:a="http://schemas.openxmlformats.org/drawingml/2006/main" xmlns:pic="http://schemas.openxmlformats.org/drawingml/2006/picture" xmlns:wp="http://schemas.openxmlformats.org/drawingml/2006/wordprocessingDrawing">
   <w:body>
-    <w:bookmarkStart w:id="39" w:name="recep-tayyip-erdoğan-university"/>
+    <w:bookmarkStart w:id="56" w:name="recep-tayyip-erdoğan-university"/>
     <w:p>
       <w:pPr>
         <w:pStyle w:val="Heading1"/>
@@ -48,7 +48,7 @@
     <w:bookmarkEnd w:id="20"/>
     <w:bookmarkEnd w:id="21"/>
     <w:bookmarkEnd w:id="22"/>
-    <w:bookmarkStart w:id="23" w:name="course-information"/>
+    <w:bookmarkStart w:id="24" w:name="course-information"/>
     <w:p>
       <w:pPr>
         <w:pStyle w:val="Heading2"/>
@@ -381,8 +381,19 @@
               <w:pStyle w:val="Compact"/>
             </w:pPr>
             <w:r>
-              <w:t xml:space="preserve">CEN107 Algorithms and Programming I (former code CE103)</w:t>
-            </w:r>
+              <w:t xml:space="preserve">CEN107 Algorithms and Programming I (former code CE103) — details:</w:t>
+            </w:r>
+            <w:r>
+              <w:t xml:space="preserve"> </w:t>
+            </w:r>
+            <w:hyperlink r:id="rId23">
+              <w:r>
+                <w:rPr>
+                  <w:rStyle w:val="Hyperlink"/>
+                </w:rPr>
+                <w:t xml:space="preserve">Prerequisites</w:t>
+              </w:r>
+            </w:hyperlink>
           </w:p>
         </w:tc>
       </w:tr>
@@ -394,8 +405,8 @@
         </w:pict>
       </w:r>
     </w:p>
-    <w:bookmarkEnd w:id="23"/>
-    <w:bookmarkStart w:id="24" w:name="a.-course-description"/>
+    <w:bookmarkEnd w:id="24"/>
+    <w:bookmarkStart w:id="25" w:name="a.-course-description"/>
     <w:p>
       <w:pPr>
         <w:pStyle w:val="Heading2"/>
@@ -455,8 +466,8 @@
         </w:pict>
       </w:r>
     </w:p>
-    <w:bookmarkEnd w:id="24"/>
-    <w:bookmarkStart w:id="26" w:name="b.-learning-outcomes"/>
+    <w:bookmarkEnd w:id="25"/>
+    <w:bookmarkStart w:id="27" w:name="b.-learning-outcomes"/>
     <w:p>
       <w:pPr>
         <w:pStyle w:val="Heading2"/>
@@ -680,7 +691,7 @@
         </w:tc>
       </w:tr>
     </w:tbl>
-    <w:bookmarkStart w:id="25" w:name="X8664d3ebde3fd601a87e584f5729272c2abc229"/>
+    <w:bookmarkStart w:id="26" w:name="X8664d3ebde3fd601a87e584f5729272c2abc229"/>
     <w:p>
       <w:pPr>
         <w:pStyle w:val="Heading3"/>
@@ -1893,9 +1904,9 @@
         </w:pict>
       </w:r>
     </w:p>
-    <w:bookmarkEnd w:id="25"/>
     <w:bookmarkEnd w:id="26"/>
-    <w:bookmarkStart w:id="27" w:name="c.-weekly-schedule"/>
+    <w:bookmarkEnd w:id="27"/>
+    <w:bookmarkStart w:id="44" w:name="c.-weekly-schedule"/>
     <w:p>
       <w:pPr>
         <w:pStyle w:val="Heading2"/>
@@ -2017,9 +2028,14 @@
             <w:pPr>
               <w:pStyle w:val="Compact"/>
             </w:pPr>
-            <w:r>
-              <w:t xml:space="preserve">1</w:t>
-            </w:r>
+            <w:hyperlink r:id="rId28">
+              <w:r>
+                <w:rPr>
+                  <w:rStyle w:val="Hyperlink"/>
+                </w:rPr>
+                <w:t xml:space="preserve">1</w:t>
+              </w:r>
+            </w:hyperlink>
           </w:p>
         </w:tc>
         <w:tc>
@@ -2063,9 +2079,14 @@
             <w:pPr>
               <w:pStyle w:val="Compact"/>
             </w:pPr>
-            <w:r>
-              <w:t xml:space="preserve">2</w:t>
-            </w:r>
+            <w:hyperlink r:id="rId29">
+              <w:r>
+                <w:rPr>
+                  <w:rStyle w:val="Hyperlink"/>
+                </w:rPr>
+                <w:t xml:space="preserve">2</w:t>
+              </w:r>
+            </w:hyperlink>
           </w:p>
         </w:tc>
         <w:tc>
@@ -2109,9 +2130,14 @@
             <w:pPr>
               <w:pStyle w:val="Compact"/>
             </w:pPr>
-            <w:r>
-              <w:t xml:space="preserve">3</w:t>
-            </w:r>
+            <w:hyperlink r:id="rId30">
+              <w:r>
+                <w:rPr>
+                  <w:rStyle w:val="Hyperlink"/>
+                </w:rPr>
+                <w:t xml:space="preserve">3</w:t>
+              </w:r>
+            </w:hyperlink>
           </w:p>
         </w:tc>
         <w:tc>
@@ -2155,9 +2181,14 @@
             <w:pPr>
               <w:pStyle w:val="Compact"/>
             </w:pPr>
-            <w:r>
-              <w:t xml:space="preserve">4</w:t>
-            </w:r>
+            <w:hyperlink r:id="rId31">
+              <w:r>
+                <w:rPr>
+                  <w:rStyle w:val="Hyperlink"/>
+                </w:rPr>
+                <w:t xml:space="preserve">4</w:t>
+              </w:r>
+            </w:hyperlink>
           </w:p>
         </w:tc>
         <w:tc>
@@ -2201,9 +2232,14 @@
             <w:pPr>
               <w:pStyle w:val="Compact"/>
             </w:pPr>
-            <w:r>
-              <w:t xml:space="preserve">5</w:t>
-            </w:r>
+            <w:hyperlink r:id="rId32">
+              <w:r>
+                <w:rPr>
+                  <w:rStyle w:val="Hyperlink"/>
+                </w:rPr>
+                <w:t xml:space="preserve">5</w:t>
+              </w:r>
+            </w:hyperlink>
           </w:p>
         </w:tc>
         <w:tc>
@@ -2247,9 +2283,14 @@
             <w:pPr>
               <w:pStyle w:val="Compact"/>
             </w:pPr>
-            <w:r>
-              <w:t xml:space="preserve">6</w:t>
-            </w:r>
+            <w:hyperlink r:id="rId33">
+              <w:r>
+                <w:rPr>
+                  <w:rStyle w:val="Hyperlink"/>
+                </w:rPr>
+                <w:t xml:space="preserve">6</w:t>
+              </w:r>
+            </w:hyperlink>
           </w:p>
         </w:tc>
         <w:tc>
@@ -2293,9 +2334,14 @@
             <w:pPr>
               <w:pStyle w:val="Compact"/>
             </w:pPr>
-            <w:r>
-              <w:t xml:space="preserve">7</w:t>
-            </w:r>
+            <w:hyperlink r:id="rId34">
+              <w:r>
+                <w:rPr>
+                  <w:rStyle w:val="Hyperlink"/>
+                </w:rPr>
+                <w:t xml:space="preserve">7</w:t>
+              </w:r>
+            </w:hyperlink>
           </w:p>
         </w:tc>
         <w:tc>
@@ -2349,9 +2395,14 @@
             <w:pPr>
               <w:pStyle w:val="Compact"/>
             </w:pPr>
-            <w:r>
-              <w:t xml:space="preserve">8</w:t>
-            </w:r>
+            <w:hyperlink r:id="rId35">
+              <w:r>
+                <w:rPr>
+                  <w:rStyle w:val="Hyperlink"/>
+                </w:rPr>
+                <w:t xml:space="preserve">8</w:t>
+              </w:r>
+            </w:hyperlink>
           </w:p>
         </w:tc>
         <w:tc>
@@ -2405,9 +2456,14 @@
             <w:pPr>
               <w:pStyle w:val="Compact"/>
             </w:pPr>
-            <w:r>
-              <w:t xml:space="preserve">9</w:t>
-            </w:r>
+            <w:hyperlink r:id="rId36">
+              <w:r>
+                <w:rPr>
+                  <w:rStyle w:val="Hyperlink"/>
+                </w:rPr>
+                <w:t xml:space="preserve">9</w:t>
+              </w:r>
+            </w:hyperlink>
           </w:p>
         </w:tc>
         <w:tc>
@@ -2451,9 +2507,14 @@
             <w:pPr>
               <w:pStyle w:val="Compact"/>
             </w:pPr>
-            <w:r>
-              <w:t xml:space="preserve">10</w:t>
-            </w:r>
+            <w:hyperlink r:id="rId37">
+              <w:r>
+                <w:rPr>
+                  <w:rStyle w:val="Hyperlink"/>
+                </w:rPr>
+                <w:t xml:space="preserve">10</w:t>
+              </w:r>
+            </w:hyperlink>
           </w:p>
         </w:tc>
         <w:tc>
@@ -2497,9 +2558,14 @@
             <w:pPr>
               <w:pStyle w:val="Compact"/>
             </w:pPr>
-            <w:r>
-              <w:t xml:space="preserve">11</w:t>
-            </w:r>
+            <w:hyperlink r:id="rId38">
+              <w:r>
+                <w:rPr>
+                  <w:rStyle w:val="Hyperlink"/>
+                </w:rPr>
+                <w:t xml:space="preserve">11</w:t>
+              </w:r>
+            </w:hyperlink>
           </w:p>
         </w:tc>
         <w:tc>
@@ -2543,9 +2609,14 @@
             <w:pPr>
               <w:pStyle w:val="Compact"/>
             </w:pPr>
-            <w:r>
-              <w:t xml:space="preserve">12</w:t>
-            </w:r>
+            <w:hyperlink r:id="rId39">
+              <w:r>
+                <w:rPr>
+                  <w:rStyle w:val="Hyperlink"/>
+                </w:rPr>
+                <w:t xml:space="preserve">12</w:t>
+              </w:r>
+            </w:hyperlink>
           </w:p>
         </w:tc>
         <w:tc>
@@ -2589,9 +2660,14 @@
             <w:pPr>
               <w:pStyle w:val="Compact"/>
             </w:pPr>
-            <w:r>
-              <w:t xml:space="preserve">13</w:t>
-            </w:r>
+            <w:hyperlink r:id="rId40">
+              <w:r>
+                <w:rPr>
+                  <w:rStyle w:val="Hyperlink"/>
+                </w:rPr>
+                <w:t xml:space="preserve">13</w:t>
+              </w:r>
+            </w:hyperlink>
           </w:p>
         </w:tc>
         <w:tc>
@@ -2635,9 +2711,14 @@
             <w:pPr>
               <w:pStyle w:val="Compact"/>
             </w:pPr>
-            <w:r>
-              <w:t xml:space="preserve">14</w:t>
-            </w:r>
+            <w:hyperlink r:id="rId41">
+              <w:r>
+                <w:rPr>
+                  <w:rStyle w:val="Hyperlink"/>
+                </w:rPr>
+                <w:t xml:space="preserve">14</w:t>
+              </w:r>
+            </w:hyperlink>
           </w:p>
         </w:tc>
         <w:tc>
@@ -2681,9 +2762,14 @@
             <w:pPr>
               <w:pStyle w:val="Compact"/>
             </w:pPr>
-            <w:r>
-              <w:t xml:space="preserve">15</w:t>
-            </w:r>
+            <w:hyperlink r:id="rId42">
+              <w:r>
+                <w:rPr>
+                  <w:rStyle w:val="Hyperlink"/>
+                </w:rPr>
+                <w:t xml:space="preserve">15</w:t>
+              </w:r>
+            </w:hyperlink>
           </w:p>
         </w:tc>
         <w:tc>
@@ -2737,9 +2823,14 @@
             <w:pPr>
               <w:pStyle w:val="Compact"/>
             </w:pPr>
-            <w:r>
-              <w:t xml:space="preserve">16</w:t>
-            </w:r>
+            <w:hyperlink r:id="rId43">
+              <w:r>
+                <w:rPr>
+                  <w:rStyle w:val="Hyperlink"/>
+                </w:rPr>
+                <w:t xml:space="preserve">16</w:t>
+              </w:r>
+            </w:hyperlink>
           </w:p>
         </w:tc>
         <w:tc>
@@ -2814,8 +2905,8 @@
         </w:pict>
       </w:r>
     </w:p>
-    <w:bookmarkEnd w:id="27"/>
-    <w:bookmarkStart w:id="28" w:name="d.-textbooks-software-and-equipment"/>
+    <w:bookmarkEnd w:id="44"/>
+    <w:bookmarkStart w:id="45" w:name="d.-textbooks-software-and-equipment"/>
     <w:p>
       <w:pPr>
         <w:pStyle w:val="Heading2"/>
@@ -3198,8 +3289,8 @@
         </w:pict>
       </w:r>
     </w:p>
-    <w:bookmarkEnd w:id="28"/>
-    <w:bookmarkStart w:id="30" w:name="e.-assessment"/>
+    <w:bookmarkEnd w:id="45"/>
+    <w:bookmarkStart w:id="47" w:name="e.-assessment"/>
     <w:p>
       <w:pPr>
         <w:pStyle w:val="Heading2"/>
@@ -3928,7 +4019,7 @@
         </m:oMath>
       </m:oMathPara>
     </w:p>
-    <w:bookmarkStart w:id="29" w:name="workload-ects-5-125-hours"/>
+    <w:bookmarkStart w:id="46" w:name="workload-ects-5-125-hours"/>
     <w:p>
       <w:pPr>
         <w:pStyle w:val="Heading3"/>
@@ -4376,9 +4467,9 @@
         </w:pict>
       </w:r>
     </w:p>
-    <w:bookmarkEnd w:id="29"/>
-    <w:bookmarkEnd w:id="30"/>
-    <w:bookmarkStart w:id="31" w:name="f.-instructional-strategies-and-methods"/>
+    <w:bookmarkEnd w:id="46"/>
+    <w:bookmarkEnd w:id="47"/>
+    <w:bookmarkStart w:id="48" w:name="f.-instructional-strategies-and-methods"/>
     <w:p>
       <w:pPr>
         <w:pStyle w:val="Heading2"/>
@@ -4426,8 +4517,8 @@
         </w:pict>
       </w:r>
     </w:p>
-    <w:bookmarkEnd w:id="31"/>
-    <w:bookmarkStart w:id="32" w:name="g.-late-homework"/>
+    <w:bookmarkEnd w:id="48"/>
+    <w:bookmarkStart w:id="49" w:name="g.-late-homework"/>
     <w:p>
       <w:pPr>
         <w:pStyle w:val="Heading2"/>
@@ -4457,8 +4548,8 @@
         </w:pict>
       </w:r>
     </w:p>
-    <w:bookmarkEnd w:id="32"/>
-    <w:bookmarkStart w:id="33" w:name="h.-course-platform-and-communication"/>
+    <w:bookmarkEnd w:id="49"/>
+    <w:bookmarkStart w:id="50" w:name="h.-course-platform-and-communication"/>
     <w:p>
       <w:pPr>
         <w:pStyle w:val="Heading2"/>
@@ -4494,8 +4585,8 @@
         </w:pict>
       </w:r>
     </w:p>
-    <w:bookmarkEnd w:id="33"/>
-    <w:bookmarkStart w:id="36" w:name="X727147e054bfc715bb874db619c5c8cfeda5a5f"/>
+    <w:bookmarkEnd w:id="50"/>
+    <w:bookmarkStart w:id="53" w:name="X727147e054bfc715bb874db619c5c8cfeda5a5f"/>
     <w:p>
       <w:pPr>
         <w:pStyle w:val="Heading2"/>
@@ -4627,7 +4718,7 @@
         <w:t xml:space="preserve">you intend to do stays within academic honesty.</w:t>
       </w:r>
     </w:p>
-    <w:bookmarkStart w:id="34" w:name="X14753e3786b6b4c08f708356f4d3d122c6218bb"/>
+    <w:bookmarkStart w:id="51" w:name="X14753e3786b6b4c08f708356f4d3d122c6218bb"/>
     <w:p>
       <w:pPr>
         <w:pStyle w:val="Heading3"/>
@@ -4732,8 +4823,8 @@
         <w:t xml:space="preserve">Working with (even paying) a tutor, provided the tutor does not do your assignment for you.</w:t>
       </w:r>
     </w:p>
-    <w:bookmarkEnd w:id="34"/>
-    <w:bookmarkStart w:id="35" w:name="b.-what-is-not-acceptable"/>
+    <w:bookmarkEnd w:id="51"/>
+    <w:bookmarkStart w:id="52" w:name="b.-what-is-not-acceptable"/>
     <w:p>
       <w:pPr>
         <w:pStyle w:val="Heading3"/>
@@ -4785,9 +4876,9 @@
         </w:pict>
       </w:r>
     </w:p>
-    <w:bookmarkEnd w:id="35"/>
-    <w:bookmarkEnd w:id="36"/>
-    <w:bookmarkStart w:id="37" w:name="j.-expectations"/>
+    <w:bookmarkEnd w:id="52"/>
+    <w:bookmarkEnd w:id="53"/>
+    <w:bookmarkStart w:id="54" w:name="j.-expectations"/>
     <w:p>
       <w:pPr>
         <w:pStyle w:val="Heading2"/>
@@ -4842,8 +4933,8 @@
         </w:pict>
       </w:r>
     </w:p>
-    <w:bookmarkEnd w:id="37"/>
-    <w:bookmarkStart w:id="38" w:name="k.-lecture-content-and-syllabus-updates"/>
+    <w:bookmarkEnd w:id="54"/>
+    <w:bookmarkStart w:id="55" w:name="k.-lecture-content-and-syllabus-updates"/>
     <w:p>
       <w:pPr>
         <w:pStyle w:val="Heading2"/>
@@ -4866,8 +4957,8 @@
         <w:t xml:space="preserve">document will be announced by the instructor.</w:t>
       </w:r>
     </w:p>
-    <w:bookmarkEnd w:id="38"/>
-    <w:bookmarkEnd w:id="39"/>
+    <w:bookmarkEnd w:id="55"/>
+    <w:bookmarkEnd w:id="56"/>
     <w:sectPr>
       <w:headerReference r:id="rId9" w:type="default"/>
       <w:footerReference r:id="rId10" w:type="default"/>

</xml_diff>